<commit_message>
Add video test in report
</commit_message>
<xml_diff>
--- a/Лабораторная работа 2/отчет/Отчет.docx
+++ b/Лабораторная работа 2/отчет/Отчет.docx
@@ -717,7 +717,27 @@
           <w:szCs w:val="28"/>
           <w:lang w:val="ru-RU"/>
         </w:rPr>
-        <w:t xml:space="preserve">Побитовый шифротекст: </w:t>
+        <w:t xml:space="preserve">Побитовый </w:t>
+      </w:r>
+      <w:proofErr w:type="spellStart"/>
+      <w:r>
+        <w:rPr>
+          <w:rFonts w:ascii="Times New Roman" w:hAnsi="Times New Roman" w:cs="Times New Roman"/>
+          <w:sz w:val="28"/>
+          <w:szCs w:val="28"/>
+          <w:lang w:val="ru-RU"/>
+        </w:rPr>
+        <w:t>шифротекст</w:t>
+      </w:r>
+      <w:proofErr w:type="spellEnd"/>
+      <w:r>
+        <w:rPr>
+          <w:rFonts w:ascii="Times New Roman" w:hAnsi="Times New Roman" w:cs="Times New Roman"/>
+          <w:sz w:val="28"/>
+          <w:szCs w:val="28"/>
+          <w:lang w:val="ru-RU"/>
+        </w:rPr>
+        <w:t xml:space="preserve">: </w:t>
       </w:r>
       <w:r>
         <w:rPr>
@@ -738,14 +758,25 @@
           <w:lang w:val="ru-RU"/>
         </w:rPr>
       </w:pPr>
-      <w:r>
-        <w:rPr>
-          <w:rFonts w:ascii="Times New Roman" w:hAnsi="Times New Roman" w:cs="Times New Roman"/>
-          <w:sz w:val="28"/>
-          <w:szCs w:val="28"/>
-          <w:lang w:val="ru-RU"/>
-        </w:rPr>
-        <w:t>Шифротекст (.</w:t>
+      <w:proofErr w:type="spellStart"/>
+      <w:r>
+        <w:rPr>
+          <w:rFonts w:ascii="Times New Roman" w:hAnsi="Times New Roman" w:cs="Times New Roman"/>
+          <w:sz w:val="28"/>
+          <w:szCs w:val="28"/>
+          <w:lang w:val="ru-RU"/>
+        </w:rPr>
+        <w:t>Шифротекст</w:t>
+      </w:r>
+      <w:proofErr w:type="spellEnd"/>
+      <w:r>
+        <w:rPr>
+          <w:rFonts w:ascii="Times New Roman" w:hAnsi="Times New Roman" w:cs="Times New Roman"/>
+          <w:sz w:val="28"/>
+          <w:szCs w:val="28"/>
+          <w:lang w:val="ru-RU"/>
+        </w:rPr>
+        <w:t xml:space="preserve"> (.</w:t>
       </w:r>
       <w:r>
         <w:rPr>
@@ -781,8 +812,29 @@
           <w:szCs w:val="28"/>
           <w:lang w:val="ru-RU"/>
         </w:rPr>
-        <w:t xml:space="preserve">{(щ4”‡цв/{ </w:t>
-      </w:r>
+        <w:t>{(щ</w:t>
+      </w:r>
+      <w:proofErr w:type="gramStart"/>
+      <w:r>
+        <w:rPr>
+          <w:rFonts w:ascii="Times New Roman" w:hAnsi="Times New Roman" w:cs="Times New Roman"/>
+          <w:sz w:val="28"/>
+          <w:szCs w:val="28"/>
+          <w:lang w:val="ru-RU"/>
+        </w:rPr>
+        <w:t>4”‡</w:t>
+      </w:r>
+      <w:proofErr w:type="gramEnd"/>
+      <w:r>
+        <w:rPr>
+          <w:rFonts w:ascii="Times New Roman" w:hAnsi="Times New Roman" w:cs="Times New Roman"/>
+          <w:sz w:val="28"/>
+          <w:szCs w:val="28"/>
+          <w:lang w:val="ru-RU"/>
+        </w:rPr>
+        <w:t xml:space="preserve">цв/{ </w:t>
+      </w:r>
+      <w:proofErr w:type="spellStart"/>
       <w:r>
         <w:rPr>
           <w:rFonts w:ascii="Times New Roman" w:hAnsi="Times New Roman" w:cs="Times New Roman"/>
@@ -792,6 +844,7 @@
         </w:rPr>
         <w:t>Њz-ЕеOC</w:t>
       </w:r>
+      <w:proofErr w:type="spellEnd"/>
     </w:p>
     <w:p>
       <w:pPr>
@@ -1532,6 +1585,9 @@
         <w:jc w:val="center"/>
       </w:pPr>
       <w:r>
+        <w:rPr>
+          <w:noProof/>
+        </w:rPr>
         <w:drawing>
           <wp:inline distT="0" distB="0" distL="0" distR="0" wp14:anchorId="5CF9CD4E" wp14:editId="1FF1CC25">
             <wp:extent cx="5940425" cy="4638675"/>
@@ -1614,7 +1670,27 @@
           <w:szCs w:val="28"/>
           <w:lang w:val="ru-RU" w:eastAsia="en-US"/>
         </w:rPr>
-        <w:t>Результат шифрования (побитово)</w:t>
+        <w:t>Результат шифрования (</w:t>
+      </w:r>
+      <w:proofErr w:type="spellStart"/>
+      <w:r>
+        <w:rPr>
+          <w:rFonts w:eastAsiaTheme="minorHAnsi"/>
+          <w:sz w:val="28"/>
+          <w:szCs w:val="28"/>
+          <w:lang w:val="ru-RU" w:eastAsia="en-US"/>
+        </w:rPr>
+        <w:t>побитово</w:t>
+      </w:r>
+      <w:proofErr w:type="spellEnd"/>
+      <w:r>
+        <w:rPr>
+          <w:rFonts w:eastAsiaTheme="minorHAnsi"/>
+          <w:sz w:val="28"/>
+          <w:szCs w:val="28"/>
+          <w:lang w:val="ru-RU" w:eastAsia="en-US"/>
+        </w:rPr>
+        <w:t>)</w:t>
       </w:r>
     </w:p>
     <w:p>
@@ -1636,6 +1712,7 @@
       </w:pPr>
       <w:r>
         <w:rPr>
+          <w:noProof/>
           <w:lang w:val="ru-RU"/>
         </w:rPr>
         <w:lastRenderedPageBreak/>
@@ -1687,6 +1764,7 @@
           <w:lang w:val="en-US" w:eastAsia="en-US"/>
         </w:rPr>
       </w:pPr>
+      <w:proofErr w:type="spellStart"/>
       <w:r>
         <w:rPr>
           <w:rFonts w:eastAsiaTheme="minorHAnsi"/>
@@ -1694,8 +1772,9 @@
           <w:szCs w:val="28"/>
           <w:lang w:val="en-US" w:eastAsia="en-US"/>
         </w:rPr>
-        <w:t>Рисунок 1.</w:t>
-      </w:r>
+        <w:t>Рисунок</w:t>
+      </w:r>
+      <w:proofErr w:type="spellEnd"/>
       <w:r>
         <w:rPr>
           <w:rFonts w:eastAsiaTheme="minorHAnsi"/>
@@ -1703,6 +1782,15 @@
           <w:szCs w:val="28"/>
           <w:lang w:val="en-US" w:eastAsia="en-US"/>
         </w:rPr>
+        <w:t xml:space="preserve"> 1.</w:t>
+      </w:r>
+      <w:r>
+        <w:rPr>
+          <w:rFonts w:eastAsiaTheme="minorHAnsi"/>
+          <w:sz w:val="28"/>
+          <w:szCs w:val="28"/>
+          <w:lang w:val="en-US" w:eastAsia="en-US"/>
+        </w:rPr>
         <w:t>9</w:t>
       </w:r>
       <w:r>
@@ -1773,6 +1861,7 @@
       <w:r>
         <w:rPr>
           <w:rFonts w:ascii="Times New Roman" w:hAnsi="Times New Roman" w:cs="Times New Roman"/>
+          <w:noProof/>
           <w:sz w:val="28"/>
           <w:szCs w:val="28"/>
           <w:lang w:val="en-US"/>
@@ -1849,7 +1938,27 @@
           <w:szCs w:val="28"/>
           <w:lang w:val="ru-RU"/>
         </w:rPr>
-        <w:t xml:space="preserve"> – Результат дешифрования (побитово)</w:t>
+        <w:t xml:space="preserve"> – Результат дешифрования (</w:t>
+      </w:r>
+      <w:proofErr w:type="spellStart"/>
+      <w:r>
+        <w:rPr>
+          <w:rFonts w:ascii="Times New Roman" w:hAnsi="Times New Roman" w:cs="Times New Roman"/>
+          <w:sz w:val="28"/>
+          <w:szCs w:val="28"/>
+          <w:lang w:val="ru-RU"/>
+        </w:rPr>
+        <w:t>побитово</w:t>
+      </w:r>
+      <w:proofErr w:type="spellEnd"/>
+      <w:r>
+        <w:rPr>
+          <w:rFonts w:ascii="Times New Roman" w:hAnsi="Times New Roman" w:cs="Times New Roman"/>
+          <w:sz w:val="28"/>
+          <w:szCs w:val="28"/>
+          <w:lang w:val="ru-RU"/>
+        </w:rPr>
+        <w:t>)</w:t>
       </w:r>
     </w:p>
     <w:p>
@@ -2420,7 +2529,27 @@
           <w:szCs w:val="28"/>
           <w:lang w:val="ru-RU"/>
         </w:rPr>
-        <w:t xml:space="preserve">Побитовый шифротекст: </w:t>
+        <w:t xml:space="preserve">Побитовый </w:t>
+      </w:r>
+      <w:proofErr w:type="spellStart"/>
+      <w:r>
+        <w:rPr>
+          <w:rFonts w:ascii="Times New Roman" w:hAnsi="Times New Roman" w:cs="Times New Roman"/>
+          <w:sz w:val="28"/>
+          <w:szCs w:val="28"/>
+          <w:lang w:val="ru-RU"/>
+        </w:rPr>
+        <w:t>шифротекст</w:t>
+      </w:r>
+      <w:proofErr w:type="spellEnd"/>
+      <w:r>
+        <w:rPr>
+          <w:rFonts w:ascii="Times New Roman" w:hAnsi="Times New Roman" w:cs="Times New Roman"/>
+          <w:sz w:val="28"/>
+          <w:szCs w:val="28"/>
+          <w:lang w:val="ru-RU"/>
+        </w:rPr>
+        <w:t xml:space="preserve">: </w:t>
       </w:r>
       <w:r>
         <w:rPr>
@@ -2441,14 +2570,25 @@
           <w:lang w:val="ru-RU"/>
         </w:rPr>
       </w:pPr>
-      <w:r>
-        <w:rPr>
-          <w:rFonts w:ascii="Times New Roman" w:hAnsi="Times New Roman" w:cs="Times New Roman"/>
-          <w:sz w:val="28"/>
-          <w:szCs w:val="28"/>
-          <w:lang w:val="ru-RU"/>
-        </w:rPr>
-        <w:t>Шифротекст (.</w:t>
+      <w:proofErr w:type="spellStart"/>
+      <w:r>
+        <w:rPr>
+          <w:rFonts w:ascii="Times New Roman" w:hAnsi="Times New Roman" w:cs="Times New Roman"/>
+          <w:sz w:val="28"/>
+          <w:szCs w:val="28"/>
+          <w:lang w:val="ru-RU"/>
+        </w:rPr>
+        <w:t>Шифротекст</w:t>
+      </w:r>
+      <w:proofErr w:type="spellEnd"/>
+      <w:r>
+        <w:rPr>
+          <w:rFonts w:ascii="Times New Roman" w:hAnsi="Times New Roman" w:cs="Times New Roman"/>
+          <w:sz w:val="28"/>
+          <w:szCs w:val="28"/>
+          <w:lang w:val="ru-RU"/>
+        </w:rPr>
+        <w:t xml:space="preserve"> (.</w:t>
       </w:r>
       <w:r>
         <w:rPr>
@@ -2477,6 +2617,7 @@
         </w:rPr>
         <w:t xml:space="preserve">: </w:t>
       </w:r>
+      <w:proofErr w:type="spellStart"/>
       <w:r>
         <w:rPr>
           <w:rFonts w:ascii="Times New Roman" w:hAnsi="Times New Roman" w:cs="Times New Roman"/>
@@ -2494,8 +2635,28 @@
           <w:lang w:val="ru-RU"/>
         </w:rPr>
         <w:softHyphen/>
-        <w:t>Q?Ќў•Ў</w:t>
-      </w:r>
+      </w:r>
+      <w:proofErr w:type="gramStart"/>
+      <w:r>
+        <w:rPr>
+          <w:rFonts w:ascii="Times New Roman" w:hAnsi="Times New Roman" w:cs="Times New Roman"/>
+          <w:sz w:val="28"/>
+          <w:szCs w:val="28"/>
+          <w:lang w:val="ru-RU"/>
+        </w:rPr>
+        <w:t>Q?Ќў</w:t>
+      </w:r>
+      <w:proofErr w:type="gramEnd"/>
+      <w:r>
+        <w:rPr>
+          <w:rFonts w:ascii="Times New Roman" w:hAnsi="Times New Roman" w:cs="Times New Roman"/>
+          <w:sz w:val="28"/>
+          <w:szCs w:val="28"/>
+          <w:lang w:val="ru-RU"/>
+        </w:rPr>
+        <w:t>•Ў</w:t>
+      </w:r>
+      <w:proofErr w:type="spellEnd"/>
     </w:p>
     <w:p>
       <w:pPr>
@@ -3101,6 +3262,9 @@
         <w:jc w:val="center"/>
       </w:pPr>
       <w:r>
+        <w:rPr>
+          <w:noProof/>
+        </w:rPr>
         <w:drawing>
           <wp:inline distT="0" distB="0" distL="0" distR="0" wp14:anchorId="50C1DF1C" wp14:editId="5BA35B89">
             <wp:extent cx="5524500" cy="4280823"/>
@@ -3201,7 +3365,27 @@
           <w:szCs w:val="28"/>
           <w:lang w:val="ru-RU" w:eastAsia="en-US"/>
         </w:rPr>
-        <w:t>Результат шифрования (побитово)</w:t>
+        <w:t>Результат шифрования (</w:t>
+      </w:r>
+      <w:proofErr w:type="spellStart"/>
+      <w:r>
+        <w:rPr>
+          <w:rFonts w:eastAsiaTheme="minorHAnsi"/>
+          <w:sz w:val="28"/>
+          <w:szCs w:val="28"/>
+          <w:lang w:val="ru-RU" w:eastAsia="en-US"/>
+        </w:rPr>
+        <w:t>побитово</w:t>
+      </w:r>
+      <w:proofErr w:type="spellEnd"/>
+      <w:r>
+        <w:rPr>
+          <w:rFonts w:eastAsiaTheme="minorHAnsi"/>
+          <w:sz w:val="28"/>
+          <w:szCs w:val="28"/>
+          <w:lang w:val="ru-RU" w:eastAsia="en-US"/>
+        </w:rPr>
+        <w:t>)</w:t>
       </w:r>
     </w:p>
     <w:p>
@@ -3214,6 +3398,7 @@
       </w:pPr>
       <w:r>
         <w:rPr>
+          <w:noProof/>
           <w:lang w:val="en-US"/>
         </w:rPr>
         <w:drawing>
@@ -3264,6 +3449,7 @@
           <w:lang w:val="en-US" w:eastAsia="en-US"/>
         </w:rPr>
       </w:pPr>
+      <w:proofErr w:type="spellStart"/>
       <w:r>
         <w:rPr>
           <w:rFonts w:eastAsiaTheme="minorHAnsi"/>
@@ -3271,8 +3457,9 @@
           <w:szCs w:val="28"/>
           <w:lang w:val="en-US" w:eastAsia="en-US"/>
         </w:rPr>
-        <w:t xml:space="preserve">Рисунок </w:t>
-      </w:r>
+        <w:t>Рисунок</w:t>
+      </w:r>
+      <w:proofErr w:type="spellEnd"/>
       <w:r>
         <w:rPr>
           <w:rFonts w:eastAsiaTheme="minorHAnsi"/>
@@ -3280,6 +3467,15 @@
           <w:szCs w:val="28"/>
           <w:lang w:val="en-US" w:eastAsia="en-US"/>
         </w:rPr>
+        <w:t xml:space="preserve"> </w:t>
+      </w:r>
+      <w:r>
+        <w:rPr>
+          <w:rFonts w:eastAsiaTheme="minorHAnsi"/>
+          <w:sz w:val="28"/>
+          <w:szCs w:val="28"/>
+          <w:lang w:val="en-US" w:eastAsia="en-US"/>
+        </w:rPr>
         <w:t>2</w:t>
       </w:r>
       <w:r>
@@ -3350,6 +3546,7 @@
       <w:r>
         <w:rPr>
           <w:rFonts w:ascii="Times New Roman" w:hAnsi="Times New Roman" w:cs="Times New Roman"/>
+          <w:noProof/>
           <w:sz w:val="28"/>
           <w:szCs w:val="28"/>
           <w:lang w:val="en-US"/>
@@ -3445,7 +3642,27 @@
           <w:szCs w:val="28"/>
           <w:lang w:val="ru-RU"/>
         </w:rPr>
-        <w:t xml:space="preserve"> – Результат дешифрования (побитово)</w:t>
+        <w:t xml:space="preserve"> – Результат дешифрования (</w:t>
+      </w:r>
+      <w:proofErr w:type="spellStart"/>
+      <w:r>
+        <w:rPr>
+          <w:rFonts w:ascii="Times New Roman" w:hAnsi="Times New Roman" w:cs="Times New Roman"/>
+          <w:sz w:val="28"/>
+          <w:szCs w:val="28"/>
+          <w:lang w:val="ru-RU"/>
+        </w:rPr>
+        <w:t>побитово</w:t>
+      </w:r>
+      <w:proofErr w:type="spellEnd"/>
+      <w:r>
+        <w:rPr>
+          <w:rFonts w:ascii="Times New Roman" w:hAnsi="Times New Roman" w:cs="Times New Roman"/>
+          <w:sz w:val="28"/>
+          <w:szCs w:val="28"/>
+          <w:lang w:val="ru-RU"/>
+        </w:rPr>
+        <w:t>)</w:t>
       </w:r>
     </w:p>
     <w:p>
@@ -3604,40 +3821,40 @@
           <w:rFonts w:ascii="Times New Roman" w:hAnsi="Times New Roman" w:cs="Times New Roman"/>
           <w:sz w:val="28"/>
           <w:szCs w:val="28"/>
-          <w:lang w:val="en-US"/>
-        </w:rPr>
-      </w:pPr>
-    </w:p>
-    <w:p>
-      <w:pPr>
-        <w:jc w:val="center"/>
-        <w:rPr>
-          <w:rFonts w:ascii="Times New Roman" w:hAnsi="Times New Roman" w:cs="Times New Roman"/>
-          <w:sz w:val="28"/>
-          <w:szCs w:val="28"/>
-          <w:lang w:val="en-US"/>
-        </w:rPr>
-      </w:pPr>
-    </w:p>
-    <w:p>
-      <w:pPr>
-        <w:jc w:val="center"/>
-        <w:rPr>
-          <w:rFonts w:ascii="Times New Roman" w:hAnsi="Times New Roman" w:cs="Times New Roman"/>
-          <w:sz w:val="28"/>
-          <w:szCs w:val="28"/>
-          <w:lang w:val="en-US"/>
-        </w:rPr>
-      </w:pPr>
-    </w:p>
-    <w:p>
-      <w:pPr>
-        <w:jc w:val="center"/>
-        <w:rPr>
-          <w:rFonts w:ascii="Times New Roman" w:hAnsi="Times New Roman" w:cs="Times New Roman"/>
-          <w:sz w:val="28"/>
-          <w:szCs w:val="28"/>
-          <w:lang w:val="en-US"/>
+          <w:lang w:val="ru-RU"/>
+        </w:rPr>
+      </w:pPr>
+    </w:p>
+    <w:p>
+      <w:pPr>
+        <w:jc w:val="center"/>
+        <w:rPr>
+          <w:rFonts w:ascii="Times New Roman" w:hAnsi="Times New Roman" w:cs="Times New Roman"/>
+          <w:sz w:val="28"/>
+          <w:szCs w:val="28"/>
+          <w:lang w:val="ru-RU"/>
+        </w:rPr>
+      </w:pPr>
+    </w:p>
+    <w:p>
+      <w:pPr>
+        <w:jc w:val="center"/>
+        <w:rPr>
+          <w:rFonts w:ascii="Times New Roman" w:hAnsi="Times New Roman" w:cs="Times New Roman"/>
+          <w:sz w:val="28"/>
+          <w:szCs w:val="28"/>
+          <w:lang w:val="ru-RU"/>
+        </w:rPr>
+      </w:pPr>
+    </w:p>
+    <w:p>
+      <w:pPr>
+        <w:jc w:val="center"/>
+        <w:rPr>
+          <w:rFonts w:ascii="Times New Roman" w:hAnsi="Times New Roman" w:cs="Times New Roman"/>
+          <w:sz w:val="28"/>
+          <w:szCs w:val="28"/>
+          <w:lang w:val="ru-RU"/>
         </w:rPr>
       </w:pPr>
     </w:p>
@@ -3708,14 +3925,45 @@
         </w:rPr>
         <w:t xml:space="preserve">): </w:t>
       </w:r>
-      <w:r>
-        <w:rPr>
-          <w:rFonts w:ascii="Times New Roman" w:hAnsi="Times New Roman" w:cs="Times New Roman"/>
-          <w:sz w:val="28"/>
-          <w:szCs w:val="28"/>
-          <w:lang w:val="ru-RU"/>
-        </w:rPr>
-        <w:t>Теор. Inform.</w:t>
+      <w:proofErr w:type="spellStart"/>
+      <w:r>
+        <w:rPr>
+          <w:rFonts w:ascii="Times New Roman" w:hAnsi="Times New Roman" w:cs="Times New Roman"/>
+          <w:sz w:val="28"/>
+          <w:szCs w:val="28"/>
+          <w:lang w:val="ru-RU"/>
+        </w:rPr>
+        <w:t>Теор</w:t>
+      </w:r>
+      <w:proofErr w:type="spellEnd"/>
+      <w:r>
+        <w:rPr>
+          <w:rFonts w:ascii="Times New Roman" w:hAnsi="Times New Roman" w:cs="Times New Roman"/>
+          <w:sz w:val="28"/>
+          <w:szCs w:val="28"/>
+          <w:lang w:val="ru-RU"/>
+        </w:rPr>
+        <w:t xml:space="preserve">. </w:t>
+      </w:r>
+      <w:proofErr w:type="spellStart"/>
+      <w:r>
+        <w:rPr>
+          <w:rFonts w:ascii="Times New Roman" w:hAnsi="Times New Roman" w:cs="Times New Roman"/>
+          <w:sz w:val="28"/>
+          <w:szCs w:val="28"/>
+          <w:lang w:val="ru-RU"/>
+        </w:rPr>
+        <w:t>Inform</w:t>
+      </w:r>
+      <w:proofErr w:type="spellEnd"/>
+      <w:r>
+        <w:rPr>
+          <w:rFonts w:ascii="Times New Roman" w:hAnsi="Times New Roman" w:cs="Times New Roman"/>
+          <w:sz w:val="28"/>
+          <w:szCs w:val="28"/>
+          <w:lang w:val="ru-RU"/>
+        </w:rPr>
+        <w:t>.</w:t>
       </w:r>
     </w:p>
     <w:p>
@@ -3818,7 +4066,27 @@
           <w:szCs w:val="28"/>
           <w:lang w:val="ru-RU"/>
         </w:rPr>
-        <w:t xml:space="preserve">Побитовый шифротекст: </w:t>
+        <w:t xml:space="preserve">Побитовый </w:t>
+      </w:r>
+      <w:proofErr w:type="spellStart"/>
+      <w:r>
+        <w:rPr>
+          <w:rFonts w:ascii="Times New Roman" w:hAnsi="Times New Roman" w:cs="Times New Roman"/>
+          <w:sz w:val="28"/>
+          <w:szCs w:val="28"/>
+          <w:lang w:val="ru-RU"/>
+        </w:rPr>
+        <w:t>шифротекст</w:t>
+      </w:r>
+      <w:proofErr w:type="spellEnd"/>
+      <w:r>
+        <w:rPr>
+          <w:rFonts w:ascii="Times New Roman" w:hAnsi="Times New Roman" w:cs="Times New Roman"/>
+          <w:sz w:val="28"/>
+          <w:szCs w:val="28"/>
+          <w:lang w:val="ru-RU"/>
+        </w:rPr>
+        <w:t xml:space="preserve">: </w:t>
       </w:r>
       <w:r>
         <w:rPr>
@@ -3839,14 +4107,25 @@
           <w:lang w:val="ru-RU"/>
         </w:rPr>
       </w:pPr>
-      <w:r>
-        <w:rPr>
-          <w:rFonts w:ascii="Times New Roman" w:hAnsi="Times New Roman" w:cs="Times New Roman"/>
-          <w:sz w:val="28"/>
-          <w:szCs w:val="28"/>
-          <w:lang w:val="ru-RU"/>
-        </w:rPr>
-        <w:t>Шифротекст (.</w:t>
+      <w:proofErr w:type="spellStart"/>
+      <w:r>
+        <w:rPr>
+          <w:rFonts w:ascii="Times New Roman" w:hAnsi="Times New Roman" w:cs="Times New Roman"/>
+          <w:sz w:val="28"/>
+          <w:szCs w:val="28"/>
+          <w:lang w:val="ru-RU"/>
+        </w:rPr>
+        <w:t>Шифротекст</w:t>
+      </w:r>
+      <w:proofErr w:type="spellEnd"/>
+      <w:r>
+        <w:rPr>
+          <w:rFonts w:ascii="Times New Roman" w:hAnsi="Times New Roman" w:cs="Times New Roman"/>
+          <w:sz w:val="28"/>
+          <w:szCs w:val="28"/>
+          <w:lang w:val="ru-RU"/>
+        </w:rPr>
+        <w:t xml:space="preserve"> (.</w:t>
       </w:r>
       <w:r>
         <w:rPr>
@@ -3875,33 +4154,17 @@
         </w:rPr>
         <w:t xml:space="preserve">: </w:t>
       </w:r>
-      <w:r>
-        <w:rPr>
-          <w:rFonts w:ascii="Times New Roman" w:hAnsi="Times New Roman" w:cs="Times New Roman"/>
-          <w:sz w:val="28"/>
-          <w:szCs w:val="28"/>
-          <w:lang w:val="en-US"/>
-        </w:rPr>
-        <w:t>z</w:t>
-      </w:r>
-      <w:r>
-        <w:rPr>
-          <w:rFonts w:ascii="Times New Roman" w:hAnsi="Times New Roman" w:cs="Times New Roman"/>
-          <w:sz w:val="28"/>
-          <w:szCs w:val="28"/>
-          <w:lang w:val="ru-RU"/>
-        </w:rPr>
-        <w:t/>
-      </w:r>
-      <w:r>
-        <w:rPr>
-          <w:rFonts w:ascii="Times New Roman" w:hAnsi="Times New Roman" w:cs="Times New Roman"/>
-          <w:sz w:val="28"/>
-          <w:szCs w:val="28"/>
-          <w:lang w:val="en-US"/>
-        </w:rPr>
-        <w:t>z</w:t>
-      </w:r>
+      <w:proofErr w:type="spellStart"/>
+      <w:r>
+        <w:rPr>
+          <w:rFonts w:ascii="Times New Roman" w:hAnsi="Times New Roman" w:cs="Times New Roman"/>
+          <w:sz w:val="28"/>
+          <w:szCs w:val="28"/>
+          <w:lang w:val="en-US"/>
+        </w:rPr>
+        <w:t>zz</w:t>
+      </w:r>
+      <w:proofErr w:type="spellEnd"/>
       <w:r>
         <w:rPr>
           <w:rFonts w:ascii="Times New Roman" w:hAnsi="Times New Roman" w:cs="Times New Roman"/>
@@ -3910,8 +4173,19 @@
           <w:lang w:val="ru-RU"/>
         </w:rPr>
         <w:softHyphen/>
-        <w:t>¶Ш·я</w:t>
-      </w:r>
+        <w:t>¶</w:t>
+      </w:r>
+      <w:proofErr w:type="spellStart"/>
+      <w:r>
+        <w:rPr>
+          <w:rFonts w:ascii="Times New Roman" w:hAnsi="Times New Roman" w:cs="Times New Roman"/>
+          <w:sz w:val="28"/>
+          <w:szCs w:val="28"/>
+          <w:lang w:val="ru-RU"/>
+        </w:rPr>
+        <w:t>Ш·я</w:t>
+      </w:r>
+      <w:proofErr w:type="spellEnd"/>
       <w:r>
         <w:rPr>
           <w:rFonts w:ascii="Times New Roman" w:hAnsi="Times New Roman" w:cs="Times New Roman"/>
@@ -3928,7 +4202,27 @@
           <w:szCs w:val="28"/>
           <w:lang w:val="ru-RU"/>
         </w:rPr>
-        <w:t>=*ТЫўѓ`</w:t>
+        <w:t>=*</w:t>
+      </w:r>
+      <w:proofErr w:type="spellStart"/>
+      <w:r>
+        <w:rPr>
+          <w:rFonts w:ascii="Times New Roman" w:hAnsi="Times New Roman" w:cs="Times New Roman"/>
+          <w:sz w:val="28"/>
+          <w:szCs w:val="28"/>
+          <w:lang w:val="ru-RU"/>
+        </w:rPr>
+        <w:t>ТЫўѓ</w:t>
+      </w:r>
+      <w:proofErr w:type="spellEnd"/>
+      <w:r>
+        <w:rPr>
+          <w:rFonts w:ascii="Times New Roman" w:hAnsi="Times New Roman" w:cs="Times New Roman"/>
+          <w:sz w:val="28"/>
+          <w:szCs w:val="28"/>
+          <w:lang w:val="ru-RU"/>
+        </w:rPr>
+        <w:t>`</w:t>
       </w:r>
     </w:p>
     <w:p>
@@ -4880,6 +5174,9 @@
         <w:jc w:val="center"/>
       </w:pPr>
       <w:r>
+        <w:rPr>
+          <w:noProof/>
+        </w:rPr>
         <w:lastRenderedPageBreak/>
         <w:drawing>
           <wp:inline distT="0" distB="0" distL="0" distR="0" wp14:anchorId="5462856D" wp14:editId="0A87170D">
@@ -4963,7 +5260,27 @@
           <w:szCs w:val="28"/>
           <w:lang w:val="ru-RU" w:eastAsia="en-US"/>
         </w:rPr>
-        <w:t>Результат шифрования (побитово)</w:t>
+        <w:t>Результат шифрования (</w:t>
+      </w:r>
+      <w:proofErr w:type="spellStart"/>
+      <w:r>
+        <w:rPr>
+          <w:rFonts w:eastAsiaTheme="minorHAnsi"/>
+          <w:sz w:val="28"/>
+          <w:szCs w:val="28"/>
+          <w:lang w:val="ru-RU" w:eastAsia="en-US"/>
+        </w:rPr>
+        <w:t>побитово</w:t>
+      </w:r>
+      <w:proofErr w:type="spellEnd"/>
+      <w:r>
+        <w:rPr>
+          <w:rFonts w:eastAsiaTheme="minorHAnsi"/>
+          <w:sz w:val="28"/>
+          <w:szCs w:val="28"/>
+          <w:lang w:val="ru-RU" w:eastAsia="en-US"/>
+        </w:rPr>
+        <w:t>)</w:t>
       </w:r>
     </w:p>
     <w:p>
@@ -4985,6 +5302,7 @@
       </w:pPr>
       <w:r>
         <w:rPr>
+          <w:noProof/>
           <w:lang w:val="ru-RU"/>
         </w:rPr>
         <w:drawing>
@@ -5035,6 +5353,7 @@
           <w:lang w:val="en-US" w:eastAsia="en-US"/>
         </w:rPr>
       </w:pPr>
+      <w:proofErr w:type="spellStart"/>
       <w:r>
         <w:rPr>
           <w:rFonts w:eastAsiaTheme="minorHAnsi"/>
@@ -5042,13 +5361,23 @@
           <w:szCs w:val="28"/>
           <w:lang w:val="en-US" w:eastAsia="en-US"/>
         </w:rPr>
-        <w:t xml:space="preserve">Рисунок </w:t>
-      </w:r>
+        <w:t>Рисунок</w:t>
+      </w:r>
+      <w:proofErr w:type="spellEnd"/>
       <w:r>
         <w:rPr>
           <w:rFonts w:eastAsiaTheme="minorHAnsi"/>
           <w:sz w:val="28"/>
           <w:szCs w:val="28"/>
+          <w:lang w:val="en-US" w:eastAsia="en-US"/>
+        </w:rPr>
+        <w:t xml:space="preserve"> </w:t>
+      </w:r>
+      <w:r>
+        <w:rPr>
+          <w:rFonts w:eastAsiaTheme="minorHAnsi"/>
+          <w:sz w:val="28"/>
+          <w:szCs w:val="28"/>
           <w:lang w:val="ru-RU" w:eastAsia="en-US"/>
         </w:rPr>
         <w:t>3.8</w:t>
@@ -5121,6 +5450,7 @@
       <w:r>
         <w:rPr>
           <w:rFonts w:ascii="Times New Roman" w:hAnsi="Times New Roman" w:cs="Times New Roman"/>
+          <w:noProof/>
           <w:sz w:val="28"/>
           <w:szCs w:val="28"/>
           <w:lang w:val="en-US"/>
@@ -5198,33 +5528,54 @@
           <w:szCs w:val="28"/>
           <w:lang w:val="ru-RU"/>
         </w:rPr>
-        <w:t xml:space="preserve"> – Результат дешифрования (побитово)</w:t>
-      </w:r>
-    </w:p>
-    <w:p>
-      <w:pPr>
-        <w:jc w:val="center"/>
-        <w:rPr>
-          <w:rFonts w:ascii="Times New Roman" w:hAnsi="Times New Roman" w:cs="Times New Roman"/>
-          <w:sz w:val="28"/>
-          <w:szCs w:val="28"/>
-          <w:lang w:val="ru-RU"/>
-        </w:rPr>
-      </w:pPr>
-    </w:p>
-    <w:p>
-      <w:pPr>
-        <w:jc w:val="center"/>
-        <w:rPr>
-          <w:rFonts w:ascii="Times New Roman" w:hAnsi="Times New Roman" w:cs="Times New Roman"/>
-          <w:sz w:val="28"/>
-          <w:szCs w:val="28"/>
-          <w:lang w:val="ru-RU"/>
-        </w:rPr>
-      </w:pPr>
-      <w:r>
-        <w:rPr>
-          <w:rFonts w:ascii="Times New Roman" w:hAnsi="Times New Roman" w:cs="Times New Roman"/>
+        <w:t xml:space="preserve"> – Результат дешифрования (</w:t>
+      </w:r>
+      <w:proofErr w:type="spellStart"/>
+      <w:r>
+        <w:rPr>
+          <w:rFonts w:ascii="Times New Roman" w:hAnsi="Times New Roman" w:cs="Times New Roman"/>
+          <w:sz w:val="28"/>
+          <w:szCs w:val="28"/>
+          <w:lang w:val="ru-RU"/>
+        </w:rPr>
+        <w:t>побитово</w:t>
+      </w:r>
+      <w:proofErr w:type="spellEnd"/>
+      <w:r>
+        <w:rPr>
+          <w:rFonts w:ascii="Times New Roman" w:hAnsi="Times New Roman" w:cs="Times New Roman"/>
+          <w:sz w:val="28"/>
+          <w:szCs w:val="28"/>
+          <w:lang w:val="ru-RU"/>
+        </w:rPr>
+        <w:t>)</w:t>
+      </w:r>
+    </w:p>
+    <w:p>
+      <w:pPr>
+        <w:jc w:val="center"/>
+        <w:rPr>
+          <w:rFonts w:ascii="Times New Roman" w:hAnsi="Times New Roman" w:cs="Times New Roman"/>
+          <w:sz w:val="28"/>
+          <w:szCs w:val="28"/>
+          <w:lang w:val="ru-RU"/>
+        </w:rPr>
+      </w:pPr>
+    </w:p>
+    <w:p>
+      <w:pPr>
+        <w:jc w:val="center"/>
+        <w:rPr>
+          <w:rFonts w:ascii="Times New Roman" w:hAnsi="Times New Roman" w:cs="Times New Roman"/>
+          <w:sz w:val="28"/>
+          <w:szCs w:val="28"/>
+          <w:lang w:val="ru-RU"/>
+        </w:rPr>
+      </w:pPr>
+      <w:r>
+        <w:rPr>
+          <w:rFonts w:ascii="Times New Roman" w:hAnsi="Times New Roman" w:cs="Times New Roman"/>
+          <w:noProof/>
           <w:sz w:val="28"/>
           <w:szCs w:val="28"/>
           <w:lang w:val="ru-RU"/>
@@ -5290,7 +5641,7 @@
           <w:rFonts w:ascii="Times New Roman" w:hAnsi="Times New Roman" w:cs="Times New Roman"/>
           <w:sz w:val="28"/>
           <w:szCs w:val="28"/>
-          <w:lang w:val="en-US"/>
+          <w:lang w:val="ru-RU"/>
         </w:rPr>
         <w:t>3.10</w:t>
       </w:r>
@@ -5347,7 +5698,7 @@
           <w:rFonts w:ascii="Times New Roman" w:hAnsi="Times New Roman" w:cs="Times New Roman"/>
           <w:sz w:val="28"/>
           <w:szCs w:val="28"/>
-          <w:lang w:val="en-US"/>
+          <w:lang w:val="ru-RU"/>
         </w:rPr>
       </w:pPr>
     </w:p>
@@ -5369,7 +5720,7 @@
           <w:rFonts w:ascii="Times New Roman" w:hAnsi="Times New Roman" w:cs="Times New Roman"/>
           <w:sz w:val="28"/>
           <w:szCs w:val="28"/>
-          <w:lang w:val="en-US"/>
+          <w:lang w:val="ru-RU"/>
         </w:rPr>
       </w:pPr>
     </w:p>
@@ -5380,7 +5731,7 @@
           <w:rFonts w:ascii="Times New Roman" w:hAnsi="Times New Roman" w:cs="Times New Roman"/>
           <w:sz w:val="28"/>
           <w:szCs w:val="28"/>
-          <w:lang w:val="en-US"/>
+          <w:lang w:val="ru-RU"/>
         </w:rPr>
       </w:pPr>
     </w:p>
@@ -5391,7 +5742,7 @@
           <w:rFonts w:ascii="Times New Roman" w:hAnsi="Times New Roman" w:cs="Times New Roman"/>
           <w:sz w:val="28"/>
           <w:szCs w:val="28"/>
-          <w:lang w:val="en-US"/>
+          <w:lang w:val="ru-RU"/>
         </w:rPr>
       </w:pPr>
     </w:p>
@@ -5402,7 +5753,7 @@
           <w:rFonts w:ascii="Times New Roman" w:hAnsi="Times New Roman" w:cs="Times New Roman"/>
           <w:sz w:val="28"/>
           <w:szCs w:val="28"/>
-          <w:lang w:val="en-US"/>
+          <w:lang w:val="ru-RU"/>
         </w:rPr>
       </w:pPr>
     </w:p>
@@ -5413,7 +5764,7 @@
           <w:rFonts w:ascii="Times New Roman" w:hAnsi="Times New Roman" w:cs="Times New Roman"/>
           <w:sz w:val="28"/>
           <w:szCs w:val="28"/>
-          <w:lang w:val="en-US"/>
+          <w:lang w:val="ru-RU"/>
         </w:rPr>
       </w:pPr>
     </w:p>
@@ -5435,16 +5786,7 @@
           <w:lang w:val="ru-RU"/>
         </w:rPr>
         <w:lastRenderedPageBreak/>
-        <w:t xml:space="preserve">Тест </w:t>
-      </w:r>
-      <w:r>
-        <w:rPr>
-          <w:rFonts w:ascii="Times New Roman" w:hAnsi="Times New Roman" w:cs="Times New Roman"/>
-          <w:sz w:val="28"/>
-          <w:szCs w:val="28"/>
-          <w:lang w:val="ru-RU"/>
-        </w:rPr>
-        <w:t>4</w:t>
+        <w:t>Тест 4</w:t>
       </w:r>
     </w:p>
     <w:p>
@@ -5543,7 +5885,7 @@
           <w:rFonts w:ascii="Times New Roman" w:hAnsi="Times New Roman" w:cs="Times New Roman"/>
           <w:sz w:val="28"/>
           <w:szCs w:val="28"/>
-          <w:lang w:val="en-US"/>
+          <w:lang w:val="ru-RU"/>
         </w:rPr>
         <w:t xml:space="preserve"> </w:t>
       </w:r>
@@ -5662,7 +6004,27 @@
           <w:szCs w:val="28"/>
           <w:lang w:val="ru-RU"/>
         </w:rPr>
-        <w:t xml:space="preserve">Побитовый шифротекст: </w:t>
+        <w:t xml:space="preserve">Побитовый </w:t>
+      </w:r>
+      <w:proofErr w:type="spellStart"/>
+      <w:r>
+        <w:rPr>
+          <w:rFonts w:ascii="Times New Roman" w:hAnsi="Times New Roman" w:cs="Times New Roman"/>
+          <w:sz w:val="28"/>
+          <w:szCs w:val="28"/>
+          <w:lang w:val="ru-RU"/>
+        </w:rPr>
+        <w:t>шифротекст</w:t>
+      </w:r>
+      <w:proofErr w:type="spellEnd"/>
+      <w:r>
+        <w:rPr>
+          <w:rFonts w:ascii="Times New Roman" w:hAnsi="Times New Roman" w:cs="Times New Roman"/>
+          <w:sz w:val="28"/>
+          <w:szCs w:val="28"/>
+          <w:lang w:val="ru-RU"/>
+        </w:rPr>
+        <w:t xml:space="preserve">: </w:t>
       </w:r>
       <w:r>
         <w:rPr>
@@ -5710,14 +6072,25 @@
           <w:lang w:val="ru-RU"/>
         </w:rPr>
       </w:pPr>
-      <w:r>
-        <w:rPr>
-          <w:rFonts w:ascii="Times New Roman" w:hAnsi="Times New Roman" w:cs="Times New Roman"/>
-          <w:sz w:val="28"/>
-          <w:szCs w:val="28"/>
-          <w:lang w:val="ru-RU"/>
-        </w:rPr>
-        <w:t>Шифротекст (.</w:t>
+      <w:proofErr w:type="spellStart"/>
+      <w:r>
+        <w:rPr>
+          <w:rFonts w:ascii="Times New Roman" w:hAnsi="Times New Roman" w:cs="Times New Roman"/>
+          <w:sz w:val="28"/>
+          <w:szCs w:val="28"/>
+          <w:lang w:val="ru-RU"/>
+        </w:rPr>
+        <w:t>Шифротекст</w:t>
+      </w:r>
+      <w:proofErr w:type="spellEnd"/>
+      <w:r>
+        <w:rPr>
+          <w:rFonts w:ascii="Times New Roman" w:hAnsi="Times New Roman" w:cs="Times New Roman"/>
+          <w:sz w:val="28"/>
+          <w:szCs w:val="28"/>
+          <w:lang w:val="ru-RU"/>
+        </w:rPr>
+        <w:t xml:space="preserve"> (.</w:t>
       </w:r>
       <w:r>
         <w:rPr>
@@ -5746,15 +6119,48 @@
         </w:rPr>
         <w:t xml:space="preserve">: </w:t>
       </w:r>
-      <w:r>
-        <w:rPr>
-          <w:rFonts w:ascii="Times New Roman" w:hAnsi="Times New Roman" w:cs="Times New Roman"/>
-          <w:sz w:val="28"/>
-          <w:szCs w:val="28"/>
-          <w:lang w:val="ru-RU"/>
-        </w:rPr>
-        <w:t>ЪЇ»№xd{tЖй</w:t>
-      </w:r>
+      <w:proofErr w:type="gramStart"/>
+      <w:r>
+        <w:rPr>
+          <w:rFonts w:ascii="Times New Roman" w:hAnsi="Times New Roman" w:cs="Times New Roman"/>
+          <w:sz w:val="28"/>
+          <w:szCs w:val="28"/>
+          <w:lang w:val="ru-RU"/>
+        </w:rPr>
+        <w:t>ЪЇ»№</w:t>
+      </w:r>
+      <w:proofErr w:type="spellStart"/>
+      <w:proofErr w:type="gramEnd"/>
+      <w:r>
+        <w:rPr>
+          <w:rFonts w:ascii="Times New Roman" w:hAnsi="Times New Roman" w:cs="Times New Roman"/>
+          <w:sz w:val="28"/>
+          <w:szCs w:val="28"/>
+          <w:lang w:val="ru-RU"/>
+        </w:rPr>
+        <w:t>xd</w:t>
+      </w:r>
+      <w:proofErr w:type="spellEnd"/>
+      <w:r>
+        <w:rPr>
+          <w:rFonts w:ascii="Times New Roman" w:hAnsi="Times New Roman" w:cs="Times New Roman"/>
+          <w:sz w:val="28"/>
+          <w:szCs w:val="28"/>
+          <w:lang w:val="ru-RU"/>
+        </w:rPr>
+        <w:t>{</w:t>
+      </w:r>
+      <w:proofErr w:type="spellStart"/>
+      <w:r>
+        <w:rPr>
+          <w:rFonts w:ascii="Times New Roman" w:hAnsi="Times New Roman" w:cs="Times New Roman"/>
+          <w:sz w:val="28"/>
+          <w:szCs w:val="28"/>
+          <w:lang w:val="ru-RU"/>
+        </w:rPr>
+        <w:t>tЖй</w:t>
+      </w:r>
+      <w:proofErr w:type="spellEnd"/>
       <w:r>
         <w:rPr>
           <w:rFonts w:ascii="Times New Roman" w:hAnsi="Times New Roman" w:cs="Times New Roman"/>
@@ -5763,7 +6169,26 @@
           <w:lang w:val="ru-RU"/>
         </w:rPr>
         <w:tab/>
-        <w:t>ЉaLІјL*­µ</w:t>
+      </w:r>
+      <w:proofErr w:type="spellStart"/>
+      <w:r>
+        <w:rPr>
+          <w:rFonts w:ascii="Times New Roman" w:hAnsi="Times New Roman" w:cs="Times New Roman"/>
+          <w:sz w:val="28"/>
+          <w:szCs w:val="28"/>
+          <w:lang w:val="ru-RU"/>
+        </w:rPr>
+        <w:t>ЉaLІјL</w:t>
+      </w:r>
+      <w:proofErr w:type="spellEnd"/>
+      <w:r>
+        <w:rPr>
+          <w:rFonts w:ascii="Times New Roman" w:hAnsi="Times New Roman" w:cs="Times New Roman"/>
+          <w:sz w:val="28"/>
+          <w:szCs w:val="28"/>
+          <w:lang w:val="ru-RU"/>
+        </w:rPr>
+        <w:t>*­µ</w:t>
       </w:r>
       <w:r>
         <w:rPr>
@@ -5797,6 +6222,7 @@
       <w:r>
         <w:rPr>
           <w:rFonts w:ascii="Times New Roman" w:hAnsi="Times New Roman" w:cs="Times New Roman"/>
+          <w:noProof/>
           <w:sz w:val="28"/>
           <w:szCs w:val="28"/>
           <w:lang w:val="ru-RU"/>
@@ -5989,6 +6415,7 @@
       <w:r>
         <w:rPr>
           <w:rFonts w:ascii="Times New Roman" w:hAnsi="Times New Roman" w:cs="Times New Roman"/>
+          <w:noProof/>
           <w:sz w:val="28"/>
           <w:szCs w:val="28"/>
           <w:lang w:val="ru-RU"/>
@@ -6138,6 +6565,7 @@
       <w:r>
         <w:rPr>
           <w:rFonts w:ascii="Times New Roman" w:hAnsi="Times New Roman" w:cs="Times New Roman"/>
+          <w:noProof/>
           <w:sz w:val="28"/>
           <w:szCs w:val="28"/>
           <w:lang w:val="ru-RU"/>
@@ -6293,6 +6721,7 @@
       <w:r>
         <w:rPr>
           <w:rFonts w:ascii="Times New Roman" w:hAnsi="Times New Roman" w:cs="Times New Roman"/>
+          <w:noProof/>
           <w:sz w:val="28"/>
           <w:szCs w:val="28"/>
           <w:lang w:val="ru-RU"/>
@@ -6498,6 +6927,9 @@
         <w:jc w:val="center"/>
       </w:pPr>
       <w:r>
+        <w:rPr>
+          <w:noProof/>
+        </w:rPr>
         <w:drawing>
           <wp:inline distT="0" distB="0" distL="0" distR="0" wp14:anchorId="2CBFC1E7" wp14:editId="35A7F61F">
             <wp:extent cx="5151120" cy="4017928"/>
@@ -6598,7 +7030,27 @@
           <w:szCs w:val="28"/>
           <w:lang w:val="ru-RU" w:eastAsia="en-US"/>
         </w:rPr>
-        <w:t>Результат шифрования (побитово)</w:t>
+        <w:t>Результат шифрования (</w:t>
+      </w:r>
+      <w:proofErr w:type="spellStart"/>
+      <w:r>
+        <w:rPr>
+          <w:rFonts w:eastAsiaTheme="minorHAnsi"/>
+          <w:sz w:val="28"/>
+          <w:szCs w:val="28"/>
+          <w:lang w:val="ru-RU" w:eastAsia="en-US"/>
+        </w:rPr>
+        <w:t>побитово</w:t>
+      </w:r>
+      <w:proofErr w:type="spellEnd"/>
+      <w:r>
+        <w:rPr>
+          <w:rFonts w:eastAsiaTheme="minorHAnsi"/>
+          <w:sz w:val="28"/>
+          <w:szCs w:val="28"/>
+          <w:lang w:val="ru-RU" w:eastAsia="en-US"/>
+        </w:rPr>
+        <w:t>)</w:t>
       </w:r>
     </w:p>
     <w:p>
@@ -6620,6 +7072,7 @@
       </w:pPr>
       <w:r>
         <w:rPr>
+          <w:noProof/>
           <w:lang w:val="ru-RU"/>
         </w:rPr>
         <w:drawing>
@@ -6756,6 +7209,7 @@
       <w:r>
         <w:rPr>
           <w:rFonts w:ascii="Times New Roman" w:hAnsi="Times New Roman" w:cs="Times New Roman"/>
+          <w:noProof/>
           <w:sz w:val="28"/>
           <w:szCs w:val="28"/>
           <w:lang w:val="ru-RU"/>
@@ -6850,33 +7304,54 @@
           <w:szCs w:val="28"/>
           <w:lang w:val="ru-RU"/>
         </w:rPr>
-        <w:t xml:space="preserve"> – Результат дешифрования (побитово)</w:t>
-      </w:r>
-    </w:p>
-    <w:p>
-      <w:pPr>
-        <w:jc w:val="center"/>
-        <w:rPr>
-          <w:rFonts w:ascii="Times New Roman" w:hAnsi="Times New Roman" w:cs="Times New Roman"/>
-          <w:sz w:val="28"/>
-          <w:szCs w:val="28"/>
-          <w:lang w:val="ru-RU"/>
-        </w:rPr>
-      </w:pPr>
-    </w:p>
-    <w:p>
-      <w:pPr>
-        <w:jc w:val="center"/>
-        <w:rPr>
-          <w:rFonts w:ascii="Times New Roman" w:hAnsi="Times New Roman" w:cs="Times New Roman"/>
-          <w:sz w:val="28"/>
-          <w:szCs w:val="28"/>
-          <w:lang w:val="ru-RU"/>
-        </w:rPr>
-      </w:pPr>
-      <w:r>
-        <w:rPr>
-          <w:rFonts w:ascii="Times New Roman" w:hAnsi="Times New Roman" w:cs="Times New Roman"/>
+        <w:t xml:space="preserve"> – Результат дешифрования (</w:t>
+      </w:r>
+      <w:proofErr w:type="spellStart"/>
+      <w:r>
+        <w:rPr>
+          <w:rFonts w:ascii="Times New Roman" w:hAnsi="Times New Roman" w:cs="Times New Roman"/>
+          <w:sz w:val="28"/>
+          <w:szCs w:val="28"/>
+          <w:lang w:val="ru-RU"/>
+        </w:rPr>
+        <w:t>побитово</w:t>
+      </w:r>
+      <w:proofErr w:type="spellEnd"/>
+      <w:r>
+        <w:rPr>
+          <w:rFonts w:ascii="Times New Roman" w:hAnsi="Times New Roman" w:cs="Times New Roman"/>
+          <w:sz w:val="28"/>
+          <w:szCs w:val="28"/>
+          <w:lang w:val="ru-RU"/>
+        </w:rPr>
+        <w:t>)</w:t>
+      </w:r>
+    </w:p>
+    <w:p>
+      <w:pPr>
+        <w:jc w:val="center"/>
+        <w:rPr>
+          <w:rFonts w:ascii="Times New Roman" w:hAnsi="Times New Roman" w:cs="Times New Roman"/>
+          <w:sz w:val="28"/>
+          <w:szCs w:val="28"/>
+          <w:lang w:val="ru-RU"/>
+        </w:rPr>
+      </w:pPr>
+    </w:p>
+    <w:p>
+      <w:pPr>
+        <w:jc w:val="center"/>
+        <w:rPr>
+          <w:rFonts w:ascii="Times New Roman" w:hAnsi="Times New Roman" w:cs="Times New Roman"/>
+          <w:sz w:val="28"/>
+          <w:szCs w:val="28"/>
+          <w:lang w:val="ru-RU"/>
+        </w:rPr>
+      </w:pPr>
+      <w:r>
+        <w:rPr>
+          <w:rFonts w:ascii="Times New Roman" w:hAnsi="Times New Roman" w:cs="Times New Roman"/>
+          <w:noProof/>
           <w:sz w:val="28"/>
           <w:szCs w:val="28"/>
           <w:lang w:val="ru-RU"/>
@@ -7009,7 +7484,7 @@
           <w:rFonts w:ascii="Times New Roman" w:hAnsi="Times New Roman" w:cs="Times New Roman"/>
           <w:sz w:val="28"/>
           <w:szCs w:val="28"/>
-          <w:lang w:val="en-US"/>
+          <w:lang w:val="ru-RU"/>
         </w:rPr>
       </w:pPr>
     </w:p>
@@ -7020,7 +7495,7 @@
           <w:rFonts w:ascii="Times New Roman" w:hAnsi="Times New Roman" w:cs="Times New Roman"/>
           <w:sz w:val="28"/>
           <w:szCs w:val="28"/>
-          <w:lang w:val="en-US"/>
+          <w:lang w:val="ru-RU"/>
         </w:rPr>
       </w:pPr>
     </w:p>
@@ -7031,7 +7506,7 @@
           <w:rFonts w:ascii="Times New Roman" w:hAnsi="Times New Roman" w:cs="Times New Roman"/>
           <w:sz w:val="28"/>
           <w:szCs w:val="28"/>
-          <w:lang w:val="en-US"/>
+          <w:lang w:val="ru-RU"/>
         </w:rPr>
       </w:pPr>
     </w:p>
@@ -7042,7 +7517,7 @@
           <w:rFonts w:ascii="Times New Roman" w:hAnsi="Times New Roman" w:cs="Times New Roman"/>
           <w:sz w:val="28"/>
           <w:szCs w:val="28"/>
-          <w:lang w:val="en-US"/>
+          <w:lang w:val="ru-RU"/>
         </w:rPr>
       </w:pPr>
     </w:p>
@@ -7053,7 +7528,7 @@
           <w:rFonts w:ascii="Times New Roman" w:hAnsi="Times New Roman" w:cs="Times New Roman"/>
           <w:sz w:val="28"/>
           <w:szCs w:val="28"/>
-          <w:lang w:val="en-US"/>
+          <w:lang w:val="ru-RU"/>
         </w:rPr>
       </w:pPr>
     </w:p>
@@ -7064,7 +7539,7 @@
           <w:rFonts w:ascii="Times New Roman" w:hAnsi="Times New Roman" w:cs="Times New Roman"/>
           <w:sz w:val="28"/>
           <w:szCs w:val="28"/>
-          <w:lang w:val="en-US"/>
+          <w:lang w:val="ru-RU"/>
         </w:rPr>
       </w:pPr>
     </w:p>
@@ -7075,7 +7550,7 @@
           <w:rFonts w:ascii="Times New Roman" w:hAnsi="Times New Roman" w:cs="Times New Roman"/>
           <w:sz w:val="28"/>
           <w:szCs w:val="28"/>
-          <w:lang w:val="en-US"/>
+          <w:lang w:val="ru-RU"/>
         </w:rPr>
       </w:pPr>
     </w:p>
@@ -7086,7 +7561,7 @@
           <w:rFonts w:ascii="Times New Roman" w:hAnsi="Times New Roman" w:cs="Times New Roman"/>
           <w:sz w:val="28"/>
           <w:szCs w:val="28"/>
-          <w:lang w:val="en-US"/>
+          <w:lang w:val="ru-RU"/>
         </w:rPr>
       </w:pPr>
     </w:p>
@@ -7097,7 +7572,7 @@
           <w:rFonts w:ascii="Times New Roman" w:hAnsi="Times New Roman" w:cs="Times New Roman"/>
           <w:sz w:val="28"/>
           <w:szCs w:val="28"/>
-          <w:lang w:val="en-US"/>
+          <w:lang w:val="ru-RU"/>
         </w:rPr>
       </w:pPr>
     </w:p>
@@ -7108,7 +7583,7 @@
           <w:rFonts w:ascii="Times New Roman" w:hAnsi="Times New Roman" w:cs="Times New Roman"/>
           <w:sz w:val="28"/>
           <w:szCs w:val="28"/>
-          <w:lang w:val="en-US"/>
+          <w:lang w:val="ru-RU"/>
         </w:rPr>
       </w:pPr>
     </w:p>
@@ -7119,7 +7594,7 @@
           <w:rFonts w:ascii="Times New Roman" w:hAnsi="Times New Roman" w:cs="Times New Roman"/>
           <w:sz w:val="28"/>
           <w:szCs w:val="28"/>
-          <w:lang w:val="en-US"/>
+          <w:lang w:val="ru-RU"/>
         </w:rPr>
       </w:pPr>
     </w:p>
@@ -7130,7 +7605,7 @@
           <w:rFonts w:ascii="Times New Roman" w:hAnsi="Times New Roman" w:cs="Times New Roman"/>
           <w:sz w:val="28"/>
           <w:szCs w:val="28"/>
-          <w:lang w:val="en-US"/>
+          <w:lang w:val="ru-RU"/>
         </w:rPr>
       </w:pPr>
     </w:p>
@@ -7141,7 +7616,7 @@
           <w:rFonts w:ascii="Times New Roman" w:hAnsi="Times New Roman" w:cs="Times New Roman"/>
           <w:sz w:val="28"/>
           <w:szCs w:val="28"/>
-          <w:lang w:val="en-US"/>
+          <w:lang w:val="ru-RU"/>
         </w:rPr>
       </w:pPr>
     </w:p>
@@ -7152,7 +7627,7 @@
           <w:rFonts w:ascii="Times New Roman" w:hAnsi="Times New Roman" w:cs="Times New Roman"/>
           <w:sz w:val="28"/>
           <w:szCs w:val="28"/>
-          <w:lang w:val="en-US"/>
+          <w:lang w:val="ru-RU"/>
         </w:rPr>
       </w:pPr>
     </w:p>
@@ -7163,7 +7638,7 @@
           <w:rFonts w:ascii="Times New Roman" w:hAnsi="Times New Roman" w:cs="Times New Roman"/>
           <w:sz w:val="28"/>
           <w:szCs w:val="28"/>
-          <w:lang w:val="en-US"/>
+          <w:lang w:val="ru-RU"/>
         </w:rPr>
       </w:pPr>
     </w:p>
@@ -7174,7 +7649,7 @@
           <w:rFonts w:ascii="Times New Roman" w:hAnsi="Times New Roman" w:cs="Times New Roman"/>
           <w:sz w:val="28"/>
           <w:szCs w:val="28"/>
-          <w:lang w:val="en-US"/>
+          <w:lang w:val="ru-RU"/>
         </w:rPr>
       </w:pPr>
     </w:p>
@@ -7185,7 +7660,7 @@
           <w:rFonts w:ascii="Times New Roman" w:hAnsi="Times New Roman" w:cs="Times New Roman"/>
           <w:sz w:val="28"/>
           <w:szCs w:val="28"/>
-          <w:lang w:val="en-US"/>
+          <w:lang w:val="ru-RU"/>
         </w:rPr>
       </w:pPr>
     </w:p>
@@ -7196,7 +7671,7 @@
           <w:rFonts w:ascii="Times New Roman" w:hAnsi="Times New Roman" w:cs="Times New Roman"/>
           <w:sz w:val="28"/>
           <w:szCs w:val="28"/>
-          <w:lang w:val="en-US"/>
+          <w:lang w:val="ru-RU"/>
         </w:rPr>
       </w:pPr>
     </w:p>
@@ -7207,7 +7682,7 @@
           <w:rFonts w:ascii="Times New Roman" w:hAnsi="Times New Roman" w:cs="Times New Roman"/>
           <w:sz w:val="28"/>
           <w:szCs w:val="28"/>
-          <w:lang w:val="en-US"/>
+          <w:lang w:val="ru-RU"/>
         </w:rPr>
       </w:pPr>
     </w:p>
@@ -7218,7 +7693,7 @@
           <w:rFonts w:ascii="Times New Roman" w:hAnsi="Times New Roman" w:cs="Times New Roman"/>
           <w:sz w:val="28"/>
           <w:szCs w:val="28"/>
-          <w:lang w:val="en-US"/>
+          <w:lang w:val="ru-RU"/>
         </w:rPr>
       </w:pPr>
     </w:p>
@@ -7229,7 +7704,7 @@
           <w:rFonts w:ascii="Times New Roman" w:hAnsi="Times New Roman" w:cs="Times New Roman"/>
           <w:sz w:val="28"/>
           <w:szCs w:val="28"/>
-          <w:lang w:val="en-US"/>
+          <w:lang w:val="ru-RU"/>
         </w:rPr>
       </w:pPr>
     </w:p>
@@ -7240,7 +7715,7 @@
           <w:rFonts w:ascii="Times New Roman" w:hAnsi="Times New Roman" w:cs="Times New Roman"/>
           <w:sz w:val="28"/>
           <w:szCs w:val="28"/>
-          <w:lang w:val="en-US"/>
+          <w:lang w:val="ru-RU"/>
         </w:rPr>
       </w:pPr>
     </w:p>
@@ -7283,6 +7758,7 @@
         </w:rPr>
         <w:t>Исходный текст (.</w:t>
       </w:r>
+      <w:proofErr w:type="spellStart"/>
       <w:r>
         <w:rPr>
           <w:rFonts w:ascii="Times New Roman" w:hAnsi="Times New Roman" w:cs="Times New Roman"/>
@@ -7292,23 +7768,15 @@
         </w:rPr>
         <w:t>ogg</w:t>
       </w:r>
-      <w:r>
-        <w:rPr>
-          <w:rFonts w:ascii="Times New Roman" w:hAnsi="Times New Roman" w:cs="Times New Roman"/>
-          <w:sz w:val="28"/>
-          <w:szCs w:val="28"/>
-          <w:lang w:val="ru-RU"/>
-        </w:rPr>
-        <w:t xml:space="preserve">): </w:t>
-      </w:r>
-      <w:r>
-        <w:rPr>
-          <w:rFonts w:ascii="Times New Roman" w:hAnsi="Times New Roman" w:cs="Times New Roman"/>
-          <w:sz w:val="28"/>
-          <w:szCs w:val="28"/>
-          <w:lang w:val="ru-RU"/>
-        </w:rPr>
-        <w:t>Теория информации</w:t>
+      <w:proofErr w:type="spellEnd"/>
+      <w:r>
+        <w:rPr>
+          <w:rFonts w:ascii="Times New Roman" w:hAnsi="Times New Roman" w:cs="Times New Roman"/>
+          <w:sz w:val="28"/>
+          <w:szCs w:val="28"/>
+          <w:lang w:val="ru-RU"/>
+        </w:rPr>
+        <w:t>): Теория информации</w:t>
       </w:r>
     </w:p>
     <w:p>
@@ -7345,6 +7813,15 @@
           <w:szCs w:val="28"/>
           <w:lang w:val="ru-RU"/>
         </w:rPr>
+        <w:t xml:space="preserve"> … </w:t>
+      </w:r>
+      <w:r>
+        <w:rPr>
+          <w:rFonts w:ascii="Times New Roman" w:hAnsi="Times New Roman" w:cs="Times New Roman"/>
+          <w:sz w:val="28"/>
+          <w:szCs w:val="28"/>
+          <w:lang w:val="ru-RU"/>
+        </w:rPr>
         <w:t xml:space="preserve"> </w:t>
       </w:r>
       <w:r>
@@ -7354,15 +7831,56 @@
           <w:szCs w:val="28"/>
           <w:lang w:val="ru-RU"/>
         </w:rPr>
-        <w:t xml:space="preserve">… </w:t>
-      </w:r>
-      <w:r>
-        <w:rPr>
-          <w:rFonts w:ascii="Times New Roman" w:hAnsi="Times New Roman" w:cs="Times New Roman"/>
-          <w:sz w:val="28"/>
-          <w:szCs w:val="28"/>
-          <w:lang w:val="ru-RU"/>
-        </w:rPr>
+        <w:t>01011001 01111010 11101110 10010000 11110010</w:t>
+      </w:r>
+    </w:p>
+    <w:p>
+      <w:pPr>
+        <w:rPr>
+          <w:rFonts w:ascii="Times New Roman" w:hAnsi="Times New Roman" w:cs="Times New Roman"/>
+          <w:sz w:val="28"/>
+          <w:szCs w:val="28"/>
+          <w:lang w:val="ru-RU"/>
+        </w:rPr>
+      </w:pPr>
+      <w:r>
+        <w:rPr>
+          <w:rFonts w:ascii="Times New Roman" w:hAnsi="Times New Roman" w:cs="Times New Roman"/>
+          <w:sz w:val="28"/>
+          <w:szCs w:val="28"/>
+          <w:lang w:val="ru-RU"/>
+        </w:rPr>
+        <w:t xml:space="preserve">Начальное значение регистра: </w:t>
+      </w:r>
+      <w:r>
+        <w:rPr>
+          <w:rFonts w:ascii="Times New Roman" w:hAnsi="Times New Roman" w:cs="Times New Roman"/>
+          <w:sz w:val="28"/>
+          <w:szCs w:val="28"/>
+          <w:lang w:val="ru-RU"/>
+        </w:rPr>
+        <w:t>11111111111111111111111111111111</w:t>
+      </w:r>
+    </w:p>
+    <w:p>
+      <w:pPr>
+        <w:rPr>
+          <w:rFonts w:ascii="Times New Roman" w:hAnsi="Times New Roman" w:cs="Times New Roman"/>
+          <w:sz w:val="28"/>
+          <w:szCs w:val="28"/>
+          <w:lang w:val="ru-RU"/>
+        </w:rPr>
+      </w:pPr>
+      <w:r>
+        <w:rPr>
+          <w:rFonts w:ascii="Times New Roman" w:hAnsi="Times New Roman" w:cs="Times New Roman"/>
+          <w:sz w:val="28"/>
+          <w:szCs w:val="28"/>
+          <w:lang w:val="ru-RU"/>
+        </w:rPr>
+        <w:t>Ключ:</w:t>
+      </w:r>
+      <w:r>
         <w:t xml:space="preserve"> </w:t>
       </w:r>
       <w:r>
@@ -7372,54 +7890,16 @@
           <w:szCs w:val="28"/>
           <w:lang w:val="ru-RU"/>
         </w:rPr>
-        <w:t>01011001 01111010 11101110 10010000 11110010</w:t>
-      </w:r>
-    </w:p>
-    <w:p>
-      <w:pPr>
-        <w:rPr>
-          <w:rFonts w:ascii="Times New Roman" w:hAnsi="Times New Roman" w:cs="Times New Roman"/>
-          <w:sz w:val="28"/>
-          <w:szCs w:val="28"/>
-          <w:lang w:val="ru-RU"/>
-        </w:rPr>
-      </w:pPr>
-      <w:r>
-        <w:rPr>
-          <w:rFonts w:ascii="Times New Roman" w:hAnsi="Times New Roman" w:cs="Times New Roman"/>
-          <w:sz w:val="28"/>
-          <w:szCs w:val="28"/>
-          <w:lang w:val="ru-RU"/>
-        </w:rPr>
-        <w:t xml:space="preserve">Начальное значение регистра: </w:t>
-      </w:r>
-      <w:r>
-        <w:rPr>
-          <w:rFonts w:ascii="Times New Roman" w:hAnsi="Times New Roman" w:cs="Times New Roman"/>
-          <w:sz w:val="28"/>
-          <w:szCs w:val="28"/>
-          <w:lang w:val="ru-RU"/>
-        </w:rPr>
-        <w:t>11111111111111111111111111111111</w:t>
-      </w:r>
-    </w:p>
-    <w:p>
-      <w:pPr>
-        <w:rPr>
-          <w:rFonts w:ascii="Times New Roman" w:hAnsi="Times New Roman" w:cs="Times New Roman"/>
-          <w:sz w:val="28"/>
-          <w:szCs w:val="28"/>
-          <w:lang w:val="ru-RU"/>
-        </w:rPr>
-      </w:pPr>
-      <w:r>
-        <w:rPr>
-          <w:rFonts w:ascii="Times New Roman" w:hAnsi="Times New Roman" w:cs="Times New Roman"/>
-          <w:sz w:val="28"/>
-          <w:szCs w:val="28"/>
-          <w:lang w:val="ru-RU"/>
-        </w:rPr>
-        <w:t>Ключ:</w:t>
+        <w:t>1111111111111111111111111111111101010101010101010101010101000000</w:t>
+      </w:r>
+      <w:r>
+        <w:rPr>
+          <w:rFonts w:ascii="Times New Roman" w:hAnsi="Times New Roman" w:cs="Times New Roman"/>
+          <w:sz w:val="28"/>
+          <w:szCs w:val="28"/>
+          <w:lang w:val="ru-RU"/>
+        </w:rPr>
+        <w:t>…</w:t>
       </w:r>
       <w:r>
         <w:t xml:space="preserve"> </w:t>
@@ -7431,8 +7911,229 @@
           <w:szCs w:val="28"/>
           <w:lang w:val="ru-RU"/>
         </w:rPr>
-        <w:t>1111111111111111111111111111111101010101010101010101010101000000</w:t>
-      </w:r>
+        <w:t>111111110010000</w:t>
+      </w:r>
+    </w:p>
+    <w:p>
+      <w:pPr>
+        <w:rPr>
+          <w:rFonts w:ascii="Times New Roman" w:hAnsi="Times New Roman" w:cs="Times New Roman"/>
+          <w:sz w:val="28"/>
+          <w:szCs w:val="28"/>
+          <w:lang w:val="ru-RU"/>
+        </w:rPr>
+      </w:pPr>
+      <w:r>
+        <w:rPr>
+          <w:rFonts w:ascii="Times New Roman" w:hAnsi="Times New Roman" w:cs="Times New Roman"/>
+          <w:sz w:val="28"/>
+          <w:szCs w:val="28"/>
+          <w:lang w:val="ru-RU"/>
+        </w:rPr>
+        <w:t xml:space="preserve">Побитовый </w:t>
+      </w:r>
+      <w:proofErr w:type="spellStart"/>
+      <w:r>
+        <w:rPr>
+          <w:rFonts w:ascii="Times New Roman" w:hAnsi="Times New Roman" w:cs="Times New Roman"/>
+          <w:sz w:val="28"/>
+          <w:szCs w:val="28"/>
+          <w:lang w:val="ru-RU"/>
+        </w:rPr>
+        <w:t>шифротекст</w:t>
+      </w:r>
+      <w:proofErr w:type="spellEnd"/>
+      <w:r>
+        <w:rPr>
+          <w:rFonts w:ascii="Times New Roman" w:hAnsi="Times New Roman" w:cs="Times New Roman"/>
+          <w:sz w:val="28"/>
+          <w:szCs w:val="28"/>
+          <w:lang w:val="ru-RU"/>
+        </w:rPr>
+        <w:t xml:space="preserve">: </w:t>
+      </w:r>
+      <w:r>
+        <w:rPr>
+          <w:rFonts w:ascii="Times New Roman" w:hAnsi="Times New Roman" w:cs="Times New Roman"/>
+          <w:sz w:val="28"/>
+          <w:szCs w:val="28"/>
+          <w:lang w:val="ru-RU"/>
+        </w:rPr>
+        <w:t>10110000 10011000 10011000 10101100 01010101 01010111 01010101 01000000 11001100 11001100 11001110 01100110 11101110 11101110 11111011</w:t>
+      </w:r>
+      <w:r>
+        <w:rPr>
+          <w:rFonts w:ascii="Times New Roman" w:hAnsi="Times New Roman" w:cs="Times New Roman"/>
+          <w:sz w:val="28"/>
+          <w:szCs w:val="28"/>
+          <w:lang w:val="ru-RU"/>
+        </w:rPr>
+        <w:t xml:space="preserve"> … </w:t>
+      </w:r>
+      <w:r>
+        <w:rPr>
+          <w:rFonts w:ascii="Times New Roman" w:hAnsi="Times New Roman" w:cs="Times New Roman"/>
+          <w:sz w:val="28"/>
+          <w:szCs w:val="28"/>
+          <w:lang w:val="ru-RU"/>
+        </w:rPr>
+        <w:t>11000000 00110000 01111011 11100010 01101110 01101111 01100010</w:t>
+      </w:r>
+    </w:p>
+    <w:p>
+      <w:pPr>
+        <w:rPr>
+          <w:rFonts w:ascii="Times New Roman" w:hAnsi="Times New Roman" w:cs="Times New Roman"/>
+          <w:sz w:val="28"/>
+          <w:szCs w:val="28"/>
+          <w:lang w:val="ru-RU"/>
+        </w:rPr>
+      </w:pPr>
+      <w:proofErr w:type="spellStart"/>
+      <w:r>
+        <w:rPr>
+          <w:rFonts w:ascii="Times New Roman" w:hAnsi="Times New Roman" w:cs="Times New Roman"/>
+          <w:sz w:val="28"/>
+          <w:szCs w:val="28"/>
+          <w:lang w:val="ru-RU"/>
+        </w:rPr>
+        <w:t>Шифротекст</w:t>
+      </w:r>
+      <w:proofErr w:type="spellEnd"/>
+      <w:r>
+        <w:rPr>
+          <w:rFonts w:ascii="Times New Roman" w:hAnsi="Times New Roman" w:cs="Times New Roman"/>
+          <w:sz w:val="28"/>
+          <w:szCs w:val="28"/>
+          <w:lang w:val="ru-RU"/>
+        </w:rPr>
+        <w:t xml:space="preserve"> (.</w:t>
+      </w:r>
+      <w:r>
+        <w:rPr>
+          <w:rFonts w:ascii="Times New Roman" w:hAnsi="Times New Roman" w:cs="Times New Roman"/>
+          <w:sz w:val="28"/>
+          <w:szCs w:val="28"/>
+          <w:lang w:val="en-US"/>
+        </w:rPr>
+        <w:t>txt</w:t>
+      </w:r>
+      <w:r>
+        <w:rPr>
+          <w:rFonts w:ascii="Times New Roman" w:hAnsi="Times New Roman" w:cs="Times New Roman"/>
+          <w:sz w:val="28"/>
+          <w:szCs w:val="28"/>
+          <w:lang w:val="ru-RU"/>
+        </w:rPr>
+        <w:t>)</w:t>
+      </w:r>
+      <w:r>
+        <w:rPr>
+          <w:rFonts w:ascii="Times New Roman" w:hAnsi="Times New Roman" w:cs="Times New Roman"/>
+          <w:sz w:val="28"/>
+          <w:szCs w:val="28"/>
+          <w:lang w:val="ru-RU"/>
+        </w:rPr>
+        <w:t>:</w:t>
+      </w:r>
+      <w:r>
+        <w:rPr>
+          <w:rFonts w:ascii="Times New Roman" w:hAnsi="Times New Roman" w:cs="Times New Roman"/>
+          <w:sz w:val="28"/>
+          <w:szCs w:val="28"/>
+          <w:lang w:val="ru-RU"/>
+        </w:rPr>
+        <w:t xml:space="preserve"> </w:t>
+      </w:r>
+      <w:r>
+        <w:rPr>
+          <w:rFonts w:ascii="Times New Roman" w:hAnsi="Times New Roman" w:cs="Times New Roman"/>
+          <w:sz w:val="28"/>
+          <w:szCs w:val="28"/>
+          <w:lang w:val="ru-RU"/>
+        </w:rPr>
+        <w:t>°¬</w:t>
+      </w:r>
+      <w:proofErr w:type="spellStart"/>
+      <w:r>
+        <w:rPr>
+          <w:rFonts w:ascii="Times New Roman" w:hAnsi="Times New Roman" w:cs="Times New Roman"/>
+          <w:sz w:val="28"/>
+          <w:szCs w:val="28"/>
+          <w:lang w:val="ru-RU"/>
+        </w:rPr>
+        <w:t>UWU@ММОfооырм‹ГГ</w:t>
+      </w:r>
+      <w:proofErr w:type="gramStart"/>
+      <w:r>
+        <w:rPr>
+          <w:rFonts w:ascii="Times New Roman" w:hAnsi="Times New Roman" w:cs="Times New Roman"/>
+          <w:sz w:val="28"/>
+          <w:szCs w:val="28"/>
+          <w:lang w:val="ru-RU"/>
+        </w:rPr>
+        <w:t>b:н</w:t>
+      </w:r>
+      <w:proofErr w:type="gramEnd"/>
+      <w:r>
+        <w:rPr>
+          <w:rFonts w:ascii="Times New Roman" w:hAnsi="Times New Roman" w:cs="Times New Roman"/>
+          <w:sz w:val="28"/>
+          <w:szCs w:val="28"/>
+          <w:lang w:val="ru-RU"/>
+        </w:rPr>
+        <w:t>·Mi</w:t>
+      </w:r>
+      <w:proofErr w:type="spellEnd"/>
+      <w:r>
+        <w:rPr>
+          <w:rFonts w:ascii="Times New Roman" w:hAnsi="Times New Roman" w:cs="Times New Roman"/>
+          <w:sz w:val="28"/>
+          <w:szCs w:val="28"/>
+          <w:lang w:val="ru-RU"/>
+        </w:rPr>
+        <w:t>&amp;</w:t>
+      </w:r>
+      <w:proofErr w:type="spellStart"/>
+      <w:r>
+        <w:rPr>
+          <w:rFonts w:ascii="Times New Roman" w:hAnsi="Times New Roman" w:cs="Times New Roman"/>
+          <w:sz w:val="28"/>
+          <w:szCs w:val="28"/>
+          <w:lang w:val="ru-RU"/>
+        </w:rPr>
+        <w:t>Pм</w:t>
+      </w:r>
+      <w:proofErr w:type="spellEnd"/>
+      <w:r>
+        <w:rPr>
+          <w:rFonts w:ascii="Times New Roman" w:hAnsi="Times New Roman" w:cs="Times New Roman"/>
+          <w:sz w:val="28"/>
+          <w:szCs w:val="28"/>
+          <w:lang w:val="ru-RU"/>
+        </w:rPr>
+        <w:t>(ъbRБ0}Ь€</w:t>
+      </w:r>
+      <w:r>
+        <w:rPr>
+          <w:rFonts w:ascii="Times New Roman" w:hAnsi="Times New Roman" w:cs="Times New Roman"/>
+          <w:sz w:val="28"/>
+          <w:szCs w:val="28"/>
+          <w:lang w:val="ru-RU"/>
+        </w:rPr>
+        <w:noBreakHyphen/>
+      </w:r>
+      <w:proofErr w:type="spellStart"/>
+      <w:r>
+        <w:rPr>
+          <w:rFonts w:ascii="Times New Roman" w:hAnsi="Times New Roman" w:cs="Times New Roman"/>
+          <w:sz w:val="28"/>
+          <w:szCs w:val="28"/>
+          <w:lang w:val="ru-RU"/>
+        </w:rPr>
+        <w:t>ъґ</w:t>
+      </w:r>
+      <w:proofErr w:type="spellEnd"/>
       <w:r>
         <w:rPr>
           <w:rFonts w:ascii="Times New Roman" w:hAnsi="Times New Roman" w:cs="Times New Roman"/>
@@ -7442,215 +8143,30 @@
         </w:rPr>
         <w:t>…</w:t>
       </w:r>
-      <w:r>
-        <w:t xml:space="preserve"> </w:t>
-      </w:r>
-      <w:r>
-        <w:rPr>
-          <w:rFonts w:ascii="Times New Roman" w:hAnsi="Times New Roman" w:cs="Times New Roman"/>
-          <w:sz w:val="28"/>
-          <w:szCs w:val="28"/>
-          <w:lang w:val="ru-RU"/>
-        </w:rPr>
-        <w:t>111111110010000</w:t>
-      </w:r>
-    </w:p>
-    <w:p>
-      <w:pPr>
-        <w:rPr>
-          <w:rFonts w:ascii="Times New Roman" w:hAnsi="Times New Roman" w:cs="Times New Roman"/>
-          <w:sz w:val="28"/>
-          <w:szCs w:val="28"/>
-          <w:lang w:val="ru-RU"/>
-        </w:rPr>
-      </w:pPr>
-      <w:r>
-        <w:rPr>
-          <w:rFonts w:ascii="Times New Roman" w:hAnsi="Times New Roman" w:cs="Times New Roman"/>
-          <w:sz w:val="28"/>
-          <w:szCs w:val="28"/>
-          <w:lang w:val="ru-RU"/>
-        </w:rPr>
-        <w:t xml:space="preserve">Побитовый шифротекст: </w:t>
-      </w:r>
-      <w:r>
-        <w:rPr>
-          <w:rFonts w:ascii="Times New Roman" w:hAnsi="Times New Roman" w:cs="Times New Roman"/>
-          <w:sz w:val="28"/>
-          <w:szCs w:val="28"/>
-          <w:lang w:val="ru-RU"/>
-        </w:rPr>
-        <w:t>10110000 10011000 10011000 10101100 01010101 01010111 01010101 01000000 11001100 11001100 11001110 01100110 11101110 11101110 11111011</w:t>
-      </w:r>
-      <w:r>
-        <w:rPr>
-          <w:rFonts w:ascii="Times New Roman" w:hAnsi="Times New Roman" w:cs="Times New Roman"/>
-          <w:sz w:val="28"/>
-          <w:szCs w:val="28"/>
-          <w:lang w:val="ru-RU"/>
-        </w:rPr>
-        <w:t xml:space="preserve"> </w:t>
-      </w:r>
-      <w:r>
-        <w:rPr>
-          <w:rFonts w:ascii="Times New Roman" w:hAnsi="Times New Roman" w:cs="Times New Roman"/>
-          <w:sz w:val="28"/>
-          <w:szCs w:val="28"/>
-          <w:lang w:val="ru-RU"/>
-        </w:rPr>
-        <w:t xml:space="preserve">… </w:t>
-      </w:r>
-      <w:r>
-        <w:rPr>
-          <w:rFonts w:ascii="Times New Roman" w:hAnsi="Times New Roman" w:cs="Times New Roman"/>
-          <w:sz w:val="28"/>
-          <w:szCs w:val="28"/>
-          <w:lang w:val="ru-RU"/>
-        </w:rPr>
-        <w:t>11000000 00110000 01111011 11100010 01101110 01101111 01100010</w:t>
-      </w:r>
-    </w:p>
-    <w:p>
-      <w:pPr>
-        <w:rPr>
-          <w:rFonts w:ascii="Times New Roman" w:hAnsi="Times New Roman" w:cs="Times New Roman"/>
-          <w:sz w:val="28"/>
-          <w:szCs w:val="28"/>
-          <w:lang w:val="ru-RU"/>
-        </w:rPr>
-      </w:pPr>
-      <w:r>
-        <w:rPr>
-          <w:rFonts w:ascii="Times New Roman" w:hAnsi="Times New Roman" w:cs="Times New Roman"/>
-          <w:sz w:val="28"/>
-          <w:szCs w:val="28"/>
-          <w:lang w:val="ru-RU"/>
-        </w:rPr>
-        <w:t>Шифротекст (.</w:t>
-      </w:r>
-      <w:r>
-        <w:rPr>
-          <w:rFonts w:ascii="Times New Roman" w:hAnsi="Times New Roman" w:cs="Times New Roman"/>
-          <w:sz w:val="28"/>
-          <w:szCs w:val="28"/>
-          <w:lang w:val="en-US"/>
-        </w:rPr>
-        <w:t>txt</w:t>
-      </w:r>
-      <w:r>
-        <w:rPr>
-          <w:rFonts w:ascii="Times New Roman" w:hAnsi="Times New Roman" w:cs="Times New Roman"/>
-          <w:sz w:val="28"/>
-          <w:szCs w:val="28"/>
-          <w:lang w:val="ru-RU"/>
-        </w:rPr>
-        <w:t>)</w:t>
-      </w:r>
-      <w:r>
-        <w:rPr>
-          <w:rFonts w:ascii="Times New Roman" w:hAnsi="Times New Roman" w:cs="Times New Roman"/>
-          <w:sz w:val="28"/>
-          <w:szCs w:val="28"/>
-          <w:lang w:val="ru-RU"/>
-        </w:rPr>
-        <w:t>:</w:t>
-      </w:r>
-      <w:r>
-        <w:rPr>
-          <w:rFonts w:ascii="Times New Roman" w:hAnsi="Times New Roman" w:cs="Times New Roman"/>
-          <w:sz w:val="28"/>
-          <w:szCs w:val="28"/>
-          <w:lang w:val="ru-RU"/>
-        </w:rPr>
-        <w:t xml:space="preserve"> </w:t>
-      </w:r>
-      <w:r>
-        <w:rPr>
-          <w:rFonts w:ascii="Times New Roman" w:hAnsi="Times New Roman" w:cs="Times New Roman"/>
-          <w:sz w:val="28"/>
-          <w:szCs w:val="28"/>
-          <w:lang w:val="ru-RU"/>
-        </w:rPr>
-        <w:t>°¬UWU@ММОfооырм‹ГГb:н·Mi</w:t>
-      </w:r>
-      <w:r>
-        <w:rPr>
-          <w:rFonts w:ascii="Times New Roman" w:hAnsi="Times New Roman" w:cs="Times New Roman"/>
-          <w:sz w:val="28"/>
-          <w:szCs w:val="28"/>
-          <w:lang w:val="ru-RU"/>
-        </w:rPr>
-        <w:t>&amp;</w:t>
-      </w:r>
-      <w:r>
-        <w:rPr>
-          <w:rFonts w:ascii="Times New Roman" w:hAnsi="Times New Roman" w:cs="Times New Roman"/>
-          <w:sz w:val="28"/>
-          <w:szCs w:val="28"/>
-          <w:lang w:val="ru-RU"/>
-        </w:rPr>
-        <w:t>Pм(ъ</w:t>
-      </w:r>
-      <w:r>
-        <w:rPr>
-          <w:rFonts w:ascii="Times New Roman" w:hAnsi="Times New Roman" w:cs="Times New Roman"/>
-          <w:sz w:val="28"/>
-          <w:szCs w:val="28"/>
-          <w:lang w:val="ru-RU"/>
-        </w:rPr>
-        <w:t>bR</w:t>
-      </w:r>
-      <w:r>
-        <w:rPr>
-          <w:rFonts w:ascii="Times New Roman" w:hAnsi="Times New Roman" w:cs="Times New Roman"/>
-          <w:sz w:val="28"/>
-          <w:szCs w:val="28"/>
-          <w:lang w:val="ru-RU"/>
-        </w:rPr>
-        <w:t>Б0}Ь€</w:t>
-      </w:r>
-      <w:r>
-        <w:rPr>
-          <w:rFonts w:ascii="Times New Roman" w:hAnsi="Times New Roman" w:cs="Times New Roman"/>
-          <w:sz w:val="28"/>
-          <w:szCs w:val="28"/>
-          <w:lang w:val="ru-RU"/>
-        </w:rPr>
-        <w:noBreakHyphen/>
-        <w:t>ъґ</w:t>
-      </w:r>
-      <w:r>
-        <w:rPr>
-          <w:rFonts w:ascii="Times New Roman" w:hAnsi="Times New Roman" w:cs="Times New Roman"/>
-          <w:sz w:val="28"/>
-          <w:szCs w:val="28"/>
-          <w:lang w:val="ru-RU"/>
-        </w:rPr>
-        <w:t>…</w:t>
-      </w:r>
-    </w:p>
-    <w:p>
-      <w:pPr>
-        <w:rPr>
-          <w:rFonts w:ascii="Times New Roman" w:hAnsi="Times New Roman" w:cs="Times New Roman"/>
-          <w:sz w:val="28"/>
-          <w:szCs w:val="28"/>
-          <w:lang w:val="ru-RU"/>
-        </w:rPr>
-      </w:pPr>
-    </w:p>
-    <w:p>
-      <w:pPr>
-        <w:rPr>
-          <w:rFonts w:ascii="Times New Roman" w:hAnsi="Times New Roman" w:cs="Times New Roman"/>
-          <w:sz w:val="28"/>
-          <w:szCs w:val="28"/>
-          <w:lang w:val="ru-RU"/>
-        </w:rPr>
-      </w:pPr>
-      <w:r>
-        <w:rPr>
-          <w:rFonts w:ascii="Times New Roman" w:hAnsi="Times New Roman" w:cs="Times New Roman"/>
+    </w:p>
+    <w:p>
+      <w:pPr>
+        <w:rPr>
+          <w:rFonts w:ascii="Times New Roman" w:hAnsi="Times New Roman" w:cs="Times New Roman"/>
+          <w:sz w:val="28"/>
+          <w:szCs w:val="28"/>
+          <w:lang w:val="ru-RU"/>
+        </w:rPr>
+      </w:pPr>
+    </w:p>
+    <w:p>
+      <w:pPr>
+        <w:rPr>
+          <w:rFonts w:ascii="Times New Roman" w:hAnsi="Times New Roman" w:cs="Times New Roman"/>
+          <w:sz w:val="28"/>
+          <w:szCs w:val="28"/>
+          <w:lang w:val="ru-RU"/>
+        </w:rPr>
+      </w:pPr>
+      <w:r>
+        <w:rPr>
+          <w:rFonts w:ascii="Times New Roman" w:hAnsi="Times New Roman" w:cs="Times New Roman"/>
+          <w:noProof/>
           <w:sz w:val="28"/>
           <w:szCs w:val="28"/>
           <w:lang w:val="ru-RU"/>
@@ -7718,7 +8234,25 @@
           <w:szCs w:val="28"/>
           <w:lang w:val="en-US"/>
         </w:rPr>
-        <w:t xml:space="preserve"> 4.1 – </w:t>
+        <w:t xml:space="preserve"> </w:t>
+      </w:r>
+      <w:r>
+        <w:rPr>
+          <w:rFonts w:ascii="Times New Roman" w:hAnsi="Times New Roman" w:cs="Times New Roman"/>
+          <w:sz w:val="28"/>
+          <w:szCs w:val="28"/>
+          <w:lang w:val="ru-RU"/>
+        </w:rPr>
+        <w:t>5</w:t>
+      </w:r>
+      <w:r>
+        <w:rPr>
+          <w:rFonts w:ascii="Times New Roman" w:hAnsi="Times New Roman" w:cs="Times New Roman"/>
+          <w:sz w:val="28"/>
+          <w:szCs w:val="28"/>
+          <w:lang w:val="en-US"/>
+        </w:rPr>
+        <w:t xml:space="preserve">.1 – </w:t>
       </w:r>
       <w:r>
         <w:rPr>
@@ -7765,6 +8299,7 @@
         </w:rPr>
         <w:t>.</w:t>
       </w:r>
+      <w:proofErr w:type="spellStart"/>
       <w:r>
         <w:rPr>
           <w:rFonts w:ascii="Times New Roman" w:hAnsi="Times New Roman" w:cs="Times New Roman"/>
@@ -7774,6 +8309,7 @@
         </w:rPr>
         <w:t>ogg</w:t>
       </w:r>
+      <w:proofErr w:type="spellEnd"/>
       <w:r>
         <w:rPr>
           <w:rFonts w:ascii="Times New Roman" w:hAnsi="Times New Roman" w:cs="Times New Roman"/>
@@ -7807,6 +8343,7 @@
       <w:r>
         <w:rPr>
           <w:rFonts w:ascii="Times New Roman" w:hAnsi="Times New Roman" w:cs="Times New Roman"/>
+          <w:noProof/>
           <w:sz w:val="28"/>
           <w:szCs w:val="28"/>
           <w:lang w:val="ru-RU"/>
@@ -7866,7 +8403,25 @@
           <w:szCs w:val="28"/>
           <w:lang w:val="ru-RU"/>
         </w:rPr>
-        <w:t xml:space="preserve">Рисунок 4.2 – Проверка в </w:t>
+        <w:t xml:space="preserve">Рисунок </w:t>
+      </w:r>
+      <w:r>
+        <w:rPr>
+          <w:rFonts w:ascii="Times New Roman" w:hAnsi="Times New Roman" w:cs="Times New Roman"/>
+          <w:sz w:val="28"/>
+          <w:szCs w:val="28"/>
+          <w:lang w:val="ru-RU"/>
+        </w:rPr>
+        <w:t>5</w:t>
+      </w:r>
+      <w:r>
+        <w:rPr>
+          <w:rFonts w:ascii="Times New Roman" w:hAnsi="Times New Roman" w:cs="Times New Roman"/>
+          <w:sz w:val="28"/>
+          <w:szCs w:val="28"/>
+          <w:lang w:val="ru-RU"/>
+        </w:rPr>
+        <w:t xml:space="preserve">.2 – Проверка в </w:t>
       </w:r>
       <w:r>
         <w:rPr>
@@ -7929,6 +8484,7 @@
       <w:r>
         <w:rPr>
           <w:rFonts w:ascii="Times New Roman" w:hAnsi="Times New Roman" w:cs="Times New Roman"/>
+          <w:noProof/>
           <w:sz w:val="28"/>
           <w:szCs w:val="28"/>
           <w:lang w:val="ru-RU"/>
@@ -7987,7 +8543,25 @@
           <w:szCs w:val="28"/>
           <w:lang w:val="ru-RU"/>
         </w:rPr>
-        <w:t xml:space="preserve">Рисунок 4.3 – Проверка в </w:t>
+        <w:t xml:space="preserve">Рисунок </w:t>
+      </w:r>
+      <w:r>
+        <w:rPr>
+          <w:rFonts w:ascii="Times New Roman" w:hAnsi="Times New Roman" w:cs="Times New Roman"/>
+          <w:sz w:val="28"/>
+          <w:szCs w:val="28"/>
+          <w:lang w:val="ru-RU"/>
+        </w:rPr>
+        <w:t>5</w:t>
+      </w:r>
+      <w:r>
+        <w:rPr>
+          <w:rFonts w:ascii="Times New Roman" w:hAnsi="Times New Roman" w:cs="Times New Roman"/>
+          <w:sz w:val="28"/>
+          <w:szCs w:val="28"/>
+          <w:lang w:val="ru-RU"/>
+        </w:rPr>
+        <w:t xml:space="preserve">.3 – Проверка в </w:t>
       </w:r>
       <w:r>
         <w:rPr>
@@ -8039,6 +8613,7 @@
       <w:r>
         <w:rPr>
           <w:rFonts w:ascii="Times New Roman" w:hAnsi="Times New Roman" w:cs="Times New Roman"/>
+          <w:noProof/>
           <w:sz w:val="28"/>
           <w:szCs w:val="28"/>
           <w:lang w:val="ru-RU"/>
@@ -8098,7 +8673,25 @@
           <w:szCs w:val="28"/>
           <w:lang w:val="ru-RU"/>
         </w:rPr>
-        <w:t xml:space="preserve">Рисунок 4.4 – Проверка в </w:t>
+        <w:t xml:space="preserve">Рисунок </w:t>
+      </w:r>
+      <w:r>
+        <w:rPr>
+          <w:rFonts w:ascii="Times New Roman" w:hAnsi="Times New Roman" w:cs="Times New Roman"/>
+          <w:sz w:val="28"/>
+          <w:szCs w:val="28"/>
+          <w:lang w:val="ru-RU"/>
+        </w:rPr>
+        <w:t>5</w:t>
+      </w:r>
+      <w:r>
+        <w:rPr>
+          <w:rFonts w:ascii="Times New Roman" w:hAnsi="Times New Roman" w:cs="Times New Roman"/>
+          <w:sz w:val="28"/>
+          <w:szCs w:val="28"/>
+          <w:lang w:val="ru-RU"/>
+        </w:rPr>
+        <w:t xml:space="preserve">.4 – Проверка в </w:t>
       </w:r>
       <w:r>
         <w:rPr>
@@ -8199,6 +8792,9 @@
         <w:jc w:val="center"/>
       </w:pPr>
       <w:r>
+        <w:rPr>
+          <w:noProof/>
+        </w:rPr>
         <w:lastRenderedPageBreak/>
         <w:drawing>
           <wp:inline distT="0" distB="0" distL="0" distR="0" wp14:anchorId="3F31A385" wp14:editId="66789254">
@@ -8264,7 +8860,7 @@
           <w:szCs w:val="28"/>
           <w:lang w:val="ru-RU" w:eastAsia="en-US"/>
         </w:rPr>
-        <w:t>4.5</w:t>
+        <w:t>5</w:t>
       </w:r>
       <w:r>
         <w:rPr>
@@ -8273,6 +8869,15 @@
           <w:szCs w:val="28"/>
           <w:lang w:val="ru-RU" w:eastAsia="en-US"/>
         </w:rPr>
+        <w:t>.5</w:t>
+      </w:r>
+      <w:r>
+        <w:rPr>
+          <w:rFonts w:eastAsiaTheme="minorHAnsi"/>
+          <w:sz w:val="28"/>
+          <w:szCs w:val="28"/>
+          <w:lang w:val="ru-RU" w:eastAsia="en-US"/>
+        </w:rPr>
         <w:t xml:space="preserve"> – </w:t>
       </w:r>
       <w:r>
@@ -8282,7 +8887,27 @@
           <w:szCs w:val="28"/>
           <w:lang w:val="ru-RU" w:eastAsia="en-US"/>
         </w:rPr>
-        <w:t>Результат шифрования (побитово)</w:t>
+        <w:t>Результат шифрования (</w:t>
+      </w:r>
+      <w:proofErr w:type="spellStart"/>
+      <w:r>
+        <w:rPr>
+          <w:rFonts w:eastAsiaTheme="minorHAnsi"/>
+          <w:sz w:val="28"/>
+          <w:szCs w:val="28"/>
+          <w:lang w:val="ru-RU" w:eastAsia="en-US"/>
+        </w:rPr>
+        <w:t>побитово</w:t>
+      </w:r>
+      <w:proofErr w:type="spellEnd"/>
+      <w:r>
+        <w:rPr>
+          <w:rFonts w:eastAsiaTheme="minorHAnsi"/>
+          <w:sz w:val="28"/>
+          <w:szCs w:val="28"/>
+          <w:lang w:val="ru-RU" w:eastAsia="en-US"/>
+        </w:rPr>
+        <w:t>)</w:t>
       </w:r>
     </w:p>
     <w:p>
@@ -8304,6 +8929,7 @@
       </w:pPr>
       <w:r>
         <w:rPr>
+          <w:noProof/>
           <w:lang w:val="ru-RU"/>
         </w:rPr>
         <w:drawing>
@@ -8370,7 +8996,7 @@
           <w:szCs w:val="28"/>
           <w:lang w:val="ru-RU" w:eastAsia="en-US"/>
         </w:rPr>
-        <w:t>4.6</w:t>
+        <w:t>5</w:t>
       </w:r>
       <w:r>
         <w:rPr>
@@ -8379,6 +9005,15 @@
           <w:szCs w:val="28"/>
           <w:lang w:val="ru-RU" w:eastAsia="en-US"/>
         </w:rPr>
+        <w:t>.6</w:t>
+      </w:r>
+      <w:r>
+        <w:rPr>
+          <w:rFonts w:eastAsiaTheme="minorHAnsi"/>
+          <w:sz w:val="28"/>
+          <w:szCs w:val="28"/>
+          <w:lang w:val="ru-RU" w:eastAsia="en-US"/>
+        </w:rPr>
         <w:t xml:space="preserve"> – </w:t>
       </w:r>
       <w:r>
@@ -8422,6 +9057,7 @@
       <w:r>
         <w:rPr>
           <w:rFonts w:ascii="Times New Roman" w:hAnsi="Times New Roman" w:cs="Times New Roman"/>
+          <w:noProof/>
           <w:sz w:val="28"/>
           <w:szCs w:val="28"/>
           <w:lang w:val="ru-RU"/>
@@ -8481,7 +9117,16 @@
           <w:szCs w:val="28"/>
           <w:lang w:val="ru-RU"/>
         </w:rPr>
-        <w:t>Рисунок 4</w:t>
+        <w:t xml:space="preserve">Рисунок </w:t>
+      </w:r>
+      <w:r>
+        <w:rPr>
+          <w:rFonts w:ascii="Times New Roman" w:hAnsi="Times New Roman" w:cs="Times New Roman"/>
+          <w:sz w:val="28"/>
+          <w:szCs w:val="28"/>
+          <w:lang w:val="ru-RU"/>
+        </w:rPr>
+        <w:t>5</w:t>
       </w:r>
       <w:r>
         <w:rPr>
@@ -8499,33 +9144,54 @@
           <w:szCs w:val="28"/>
           <w:lang w:val="ru-RU"/>
         </w:rPr>
-        <w:t>7 – Результат дешифрования (побитово)</w:t>
-      </w:r>
-    </w:p>
-    <w:p>
-      <w:pPr>
-        <w:jc w:val="center"/>
-        <w:rPr>
-          <w:rFonts w:ascii="Times New Roman" w:hAnsi="Times New Roman" w:cs="Times New Roman"/>
-          <w:sz w:val="28"/>
-          <w:szCs w:val="28"/>
-          <w:lang w:val="ru-RU"/>
-        </w:rPr>
-      </w:pPr>
-    </w:p>
-    <w:p>
-      <w:pPr>
-        <w:jc w:val="center"/>
-        <w:rPr>
-          <w:rFonts w:ascii="Times New Roman" w:hAnsi="Times New Roman" w:cs="Times New Roman"/>
-          <w:sz w:val="28"/>
-          <w:szCs w:val="28"/>
-          <w:lang w:val="ru-RU"/>
-        </w:rPr>
-      </w:pPr>
-      <w:r>
-        <w:rPr>
-          <w:rFonts w:ascii="Times New Roman" w:hAnsi="Times New Roman" w:cs="Times New Roman"/>
+        <w:t>7 – Результат дешифрования (</w:t>
+      </w:r>
+      <w:proofErr w:type="spellStart"/>
+      <w:r>
+        <w:rPr>
+          <w:rFonts w:ascii="Times New Roman" w:hAnsi="Times New Roman" w:cs="Times New Roman"/>
+          <w:sz w:val="28"/>
+          <w:szCs w:val="28"/>
+          <w:lang w:val="ru-RU"/>
+        </w:rPr>
+        <w:t>побитово</w:t>
+      </w:r>
+      <w:proofErr w:type="spellEnd"/>
+      <w:r>
+        <w:rPr>
+          <w:rFonts w:ascii="Times New Roman" w:hAnsi="Times New Roman" w:cs="Times New Roman"/>
+          <w:sz w:val="28"/>
+          <w:szCs w:val="28"/>
+          <w:lang w:val="ru-RU"/>
+        </w:rPr>
+        <w:t>)</w:t>
+      </w:r>
+    </w:p>
+    <w:p>
+      <w:pPr>
+        <w:jc w:val="center"/>
+        <w:rPr>
+          <w:rFonts w:ascii="Times New Roman" w:hAnsi="Times New Roman" w:cs="Times New Roman"/>
+          <w:sz w:val="28"/>
+          <w:szCs w:val="28"/>
+          <w:lang w:val="ru-RU"/>
+        </w:rPr>
+      </w:pPr>
+    </w:p>
+    <w:p>
+      <w:pPr>
+        <w:jc w:val="center"/>
+        <w:rPr>
+          <w:rFonts w:ascii="Times New Roman" w:hAnsi="Times New Roman" w:cs="Times New Roman"/>
+          <w:sz w:val="28"/>
+          <w:szCs w:val="28"/>
+          <w:lang w:val="ru-RU"/>
+        </w:rPr>
+      </w:pPr>
+      <w:r>
+        <w:rPr>
+          <w:rFonts w:ascii="Times New Roman" w:hAnsi="Times New Roman" w:cs="Times New Roman"/>
+          <w:noProof/>
           <w:sz w:val="28"/>
           <w:szCs w:val="28"/>
           <w:lang w:val="ru-RU"/>
@@ -8574,17 +9240,26 @@
           <w:rFonts w:ascii="Times New Roman" w:hAnsi="Times New Roman" w:cs="Times New Roman"/>
           <w:sz w:val="28"/>
           <w:szCs w:val="28"/>
-          <w:lang w:val="en-US"/>
-        </w:rPr>
-      </w:pPr>
-      <w:r>
-        <w:rPr>
-          <w:rFonts w:ascii="Times New Roman" w:hAnsi="Times New Roman" w:cs="Times New Roman"/>
-          <w:sz w:val="28"/>
-          <w:szCs w:val="28"/>
-          <w:lang w:val="ru-RU"/>
-        </w:rPr>
-        <w:t>Рисунок 4</w:t>
+          <w:lang w:val="ru-RU"/>
+        </w:rPr>
+      </w:pPr>
+      <w:r>
+        <w:rPr>
+          <w:rFonts w:ascii="Times New Roman" w:hAnsi="Times New Roman" w:cs="Times New Roman"/>
+          <w:sz w:val="28"/>
+          <w:szCs w:val="28"/>
+          <w:lang w:val="ru-RU"/>
+        </w:rPr>
+        <w:t xml:space="preserve">Рисунок </w:t>
+      </w:r>
+      <w:r>
+        <w:rPr>
+          <w:rFonts w:ascii="Times New Roman" w:hAnsi="Times New Roman" w:cs="Times New Roman"/>
+          <w:sz w:val="28"/>
+          <w:szCs w:val="28"/>
+          <w:lang w:val="ru-RU"/>
+        </w:rPr>
+        <w:t>5</w:t>
       </w:r>
       <w:r>
         <w:rPr>
@@ -8613,6 +9288,7 @@
         </w:rPr>
         <w:t>.</w:t>
       </w:r>
+      <w:proofErr w:type="spellStart"/>
       <w:r>
         <w:rPr>
           <w:rFonts w:ascii="Times New Roman" w:hAnsi="Times New Roman" w:cs="Times New Roman"/>
@@ -8622,6 +9298,7 @@
         </w:rPr>
         <w:t>ogg</w:t>
       </w:r>
+      <w:proofErr w:type="spellEnd"/>
       <w:r>
         <w:rPr>
           <w:rFonts w:ascii="Times New Roman" w:hAnsi="Times New Roman" w:cs="Times New Roman"/>
@@ -8658,6 +9335,1774 @@
         </w:rPr>
         <w:t>audio</w:t>
       </w:r>
+    </w:p>
+    <w:p>
+      <w:pPr>
+        <w:jc w:val="center"/>
+        <w:rPr>
+          <w:rFonts w:ascii="Times New Roman" w:hAnsi="Times New Roman" w:cs="Times New Roman"/>
+          <w:sz w:val="28"/>
+          <w:szCs w:val="28"/>
+          <w:lang w:val="ru-RU"/>
+        </w:rPr>
+      </w:pPr>
+    </w:p>
+    <w:p>
+      <w:pPr>
+        <w:jc w:val="center"/>
+        <w:rPr>
+          <w:rFonts w:ascii="Times New Roman" w:hAnsi="Times New Roman" w:cs="Times New Roman"/>
+          <w:sz w:val="28"/>
+          <w:szCs w:val="28"/>
+          <w:lang w:val="ru-RU"/>
+        </w:rPr>
+      </w:pPr>
+    </w:p>
+    <w:p>
+      <w:pPr>
+        <w:jc w:val="both"/>
+        <w:rPr>
+          <w:rFonts w:ascii="Times New Roman" w:hAnsi="Times New Roman" w:cs="Times New Roman"/>
+          <w:sz w:val="28"/>
+          <w:szCs w:val="28"/>
+          <w:lang w:val="ru-RU"/>
+        </w:rPr>
+      </w:pPr>
+      <w:r>
+        <w:rPr>
+          <w:rFonts w:ascii="Times New Roman" w:hAnsi="Times New Roman" w:cs="Times New Roman"/>
+          <w:sz w:val="28"/>
+          <w:szCs w:val="28"/>
+          <w:lang w:val="ru-RU"/>
+        </w:rPr>
+        <w:lastRenderedPageBreak/>
+        <w:t xml:space="preserve">Тест </w:t>
+      </w:r>
+      <w:r>
+        <w:rPr>
+          <w:rFonts w:ascii="Times New Roman" w:hAnsi="Times New Roman" w:cs="Times New Roman"/>
+          <w:sz w:val="28"/>
+          <w:szCs w:val="28"/>
+          <w:lang w:val="ru-RU"/>
+        </w:rPr>
+        <w:t>6</w:t>
+      </w:r>
+    </w:p>
+    <w:p>
+      <w:pPr>
+        <w:rPr>
+          <w:rFonts w:ascii="Times New Roman" w:hAnsi="Times New Roman" w:cs="Times New Roman"/>
+          <w:sz w:val="28"/>
+          <w:szCs w:val="28"/>
+          <w:lang w:val="ru-RU"/>
+        </w:rPr>
+      </w:pPr>
+      <w:r>
+        <w:rPr>
+          <w:rFonts w:ascii="Times New Roman" w:hAnsi="Times New Roman" w:cs="Times New Roman"/>
+          <w:sz w:val="28"/>
+          <w:szCs w:val="28"/>
+          <w:lang w:val="ru-RU"/>
+        </w:rPr>
+        <w:t>Исходный текст (.</w:t>
+      </w:r>
+      <w:proofErr w:type="spellStart"/>
+      <w:r>
+        <w:rPr>
+          <w:rFonts w:ascii="Times New Roman" w:hAnsi="Times New Roman" w:cs="Times New Roman"/>
+          <w:sz w:val="28"/>
+          <w:szCs w:val="28"/>
+          <w:lang w:val="en-US"/>
+        </w:rPr>
+        <w:t>mp</w:t>
+      </w:r>
+      <w:proofErr w:type="spellEnd"/>
+      <w:r>
+        <w:rPr>
+          <w:rFonts w:ascii="Times New Roman" w:hAnsi="Times New Roman" w:cs="Times New Roman"/>
+          <w:sz w:val="28"/>
+          <w:szCs w:val="28"/>
+          <w:lang w:val="ru-RU"/>
+        </w:rPr>
+        <w:t>4</w:t>
+      </w:r>
+      <w:r>
+        <w:rPr>
+          <w:rFonts w:ascii="Times New Roman" w:hAnsi="Times New Roman" w:cs="Times New Roman"/>
+          <w:sz w:val="28"/>
+          <w:szCs w:val="28"/>
+          <w:lang w:val="ru-RU"/>
+        </w:rPr>
+        <w:t xml:space="preserve">): </w:t>
+      </w:r>
+      <w:r>
+        <w:rPr>
+          <w:rFonts w:ascii="Times New Roman" w:hAnsi="Times New Roman" w:cs="Times New Roman"/>
+          <w:sz w:val="28"/>
+          <w:szCs w:val="28"/>
+          <w:lang w:val="ru-RU"/>
+        </w:rPr>
+        <w:t>видео формат</w:t>
+      </w:r>
+    </w:p>
+    <w:p>
+      <w:pPr>
+        <w:rPr>
+          <w:rFonts w:ascii="Times New Roman" w:hAnsi="Times New Roman" w:cs="Times New Roman"/>
+          <w:sz w:val="28"/>
+          <w:szCs w:val="28"/>
+          <w:lang w:val="ru-RU"/>
+        </w:rPr>
+      </w:pPr>
+      <w:r>
+        <w:rPr>
+          <w:rFonts w:ascii="Times New Roman" w:hAnsi="Times New Roman" w:cs="Times New Roman"/>
+          <w:sz w:val="28"/>
+          <w:szCs w:val="28"/>
+          <w:lang w:val="ru-RU"/>
+        </w:rPr>
+        <w:t xml:space="preserve">Побитовый исходный текст: </w:t>
+      </w:r>
+      <w:r>
+        <w:rPr>
+          <w:rFonts w:ascii="Times New Roman" w:hAnsi="Times New Roman" w:cs="Times New Roman"/>
+          <w:sz w:val="28"/>
+          <w:szCs w:val="28"/>
+          <w:lang w:val="ru-RU"/>
+        </w:rPr>
+        <w:t>00000000 00000000 00000000 00100000 01100110 01110100 01111001 01110000 01101001 01110011 01101111 01101101 00000000 00000000 00000010</w:t>
+      </w:r>
+      <w:r>
+        <w:rPr>
+          <w:rFonts w:ascii="Times New Roman" w:hAnsi="Times New Roman" w:cs="Times New Roman"/>
+          <w:sz w:val="28"/>
+          <w:szCs w:val="28"/>
+          <w:lang w:val="ru-RU"/>
+        </w:rPr>
+        <w:t xml:space="preserve"> </w:t>
+      </w:r>
+      <w:r>
+        <w:rPr>
+          <w:rFonts w:ascii="Times New Roman" w:hAnsi="Times New Roman" w:cs="Times New Roman"/>
+          <w:sz w:val="28"/>
+          <w:szCs w:val="28"/>
+          <w:lang w:val="ru-RU"/>
+        </w:rPr>
+        <w:t xml:space="preserve">… </w:t>
+      </w:r>
+      <w:r>
+        <w:rPr>
+          <w:rFonts w:ascii="Times New Roman" w:hAnsi="Times New Roman" w:cs="Times New Roman"/>
+          <w:sz w:val="28"/>
+          <w:szCs w:val="28"/>
+          <w:lang w:val="ru-RU"/>
+        </w:rPr>
+        <w:t xml:space="preserve"> </w:t>
+      </w:r>
+      <w:r>
+        <w:rPr>
+          <w:rFonts w:ascii="Times New Roman" w:hAnsi="Times New Roman" w:cs="Times New Roman"/>
+          <w:sz w:val="28"/>
+          <w:szCs w:val="28"/>
+          <w:lang w:val="ru-RU"/>
+        </w:rPr>
+        <w:t>00100001 00010000 00000100 01100000 10001100 00011100</w:t>
+      </w:r>
+    </w:p>
+    <w:p>
+      <w:pPr>
+        <w:rPr>
+          <w:rFonts w:ascii="Times New Roman" w:hAnsi="Times New Roman" w:cs="Times New Roman"/>
+          <w:sz w:val="28"/>
+          <w:szCs w:val="28"/>
+          <w:lang w:val="ru-RU"/>
+        </w:rPr>
+      </w:pPr>
+      <w:r>
+        <w:rPr>
+          <w:rFonts w:ascii="Times New Roman" w:hAnsi="Times New Roman" w:cs="Times New Roman"/>
+          <w:sz w:val="28"/>
+          <w:szCs w:val="28"/>
+          <w:lang w:val="ru-RU"/>
+        </w:rPr>
+        <w:t xml:space="preserve">Начальное значение регистра: </w:t>
+      </w:r>
+      <w:r>
+        <w:rPr>
+          <w:rFonts w:ascii="Times New Roman" w:hAnsi="Times New Roman" w:cs="Times New Roman"/>
+          <w:sz w:val="28"/>
+          <w:szCs w:val="28"/>
+          <w:lang w:val="ru-RU"/>
+        </w:rPr>
+        <w:t>11111111111111111111111111111111</w:t>
+      </w:r>
+    </w:p>
+    <w:p>
+      <w:pPr>
+        <w:rPr>
+          <w:rFonts w:ascii="Times New Roman" w:hAnsi="Times New Roman" w:cs="Times New Roman"/>
+          <w:sz w:val="28"/>
+          <w:szCs w:val="28"/>
+          <w:lang w:val="ru-RU"/>
+        </w:rPr>
+      </w:pPr>
+      <w:r>
+        <w:rPr>
+          <w:rFonts w:ascii="Times New Roman" w:hAnsi="Times New Roman" w:cs="Times New Roman"/>
+          <w:sz w:val="28"/>
+          <w:szCs w:val="28"/>
+          <w:lang w:val="ru-RU"/>
+        </w:rPr>
+        <w:t>Ключ:</w:t>
+      </w:r>
+      <w:r>
+        <w:t xml:space="preserve"> </w:t>
+      </w:r>
+      <w:r>
+        <w:rPr>
+          <w:rFonts w:ascii="Times New Roman" w:hAnsi="Times New Roman" w:cs="Times New Roman"/>
+          <w:sz w:val="28"/>
+          <w:szCs w:val="28"/>
+          <w:lang w:val="ru-RU"/>
+        </w:rPr>
+        <w:t>1111111111111111111111111111111101010101010101010101010101000000</w:t>
+      </w:r>
+      <w:r>
+        <w:rPr>
+          <w:rFonts w:ascii="Times New Roman" w:hAnsi="Times New Roman" w:cs="Times New Roman"/>
+          <w:sz w:val="28"/>
+          <w:szCs w:val="28"/>
+          <w:lang w:val="ru-RU"/>
+        </w:rPr>
+        <w:t>…</w:t>
+      </w:r>
+      <w:r>
+        <w:t xml:space="preserve"> </w:t>
+      </w:r>
+      <w:r>
+        <w:rPr>
+          <w:rFonts w:ascii="Times New Roman" w:hAnsi="Times New Roman" w:cs="Times New Roman"/>
+          <w:sz w:val="28"/>
+          <w:szCs w:val="28"/>
+          <w:lang w:val="ru-RU"/>
+        </w:rPr>
+        <w:t>101110111010100001111010001111011010011111000</w:t>
+      </w:r>
+    </w:p>
+    <w:p>
+      <w:pPr>
+        <w:rPr>
+          <w:rFonts w:ascii="Times New Roman" w:hAnsi="Times New Roman" w:cs="Times New Roman"/>
+          <w:sz w:val="28"/>
+          <w:szCs w:val="28"/>
+          <w:lang w:val="ru-RU"/>
+        </w:rPr>
+      </w:pPr>
+      <w:r>
+        <w:rPr>
+          <w:rFonts w:ascii="Times New Roman" w:hAnsi="Times New Roman" w:cs="Times New Roman"/>
+          <w:sz w:val="28"/>
+          <w:szCs w:val="28"/>
+          <w:lang w:val="ru-RU"/>
+        </w:rPr>
+        <w:t xml:space="preserve">Побитовый </w:t>
+      </w:r>
+      <w:proofErr w:type="spellStart"/>
+      <w:r>
+        <w:rPr>
+          <w:rFonts w:ascii="Times New Roman" w:hAnsi="Times New Roman" w:cs="Times New Roman"/>
+          <w:sz w:val="28"/>
+          <w:szCs w:val="28"/>
+          <w:lang w:val="ru-RU"/>
+        </w:rPr>
+        <w:t>шифротекст</w:t>
+      </w:r>
+      <w:proofErr w:type="spellEnd"/>
+      <w:r>
+        <w:rPr>
+          <w:rFonts w:ascii="Times New Roman" w:hAnsi="Times New Roman" w:cs="Times New Roman"/>
+          <w:sz w:val="28"/>
+          <w:szCs w:val="28"/>
+          <w:lang w:val="ru-RU"/>
+        </w:rPr>
+        <w:t xml:space="preserve">: </w:t>
+      </w:r>
+      <w:r>
+        <w:rPr>
+          <w:rFonts w:ascii="Times New Roman" w:hAnsi="Times New Roman" w:cs="Times New Roman"/>
+          <w:sz w:val="28"/>
+          <w:szCs w:val="28"/>
+          <w:lang w:val="ru-RU"/>
+        </w:rPr>
+        <w:t xml:space="preserve">11111111 11111111 11111111 11011111 00110011 00100001 00101100 00110000 10100101 10111111 10100001 00001011 11101110 11101110 10111010 </w:t>
+      </w:r>
+      <w:r>
+        <w:rPr>
+          <w:rFonts w:ascii="Times New Roman" w:hAnsi="Times New Roman" w:cs="Times New Roman"/>
+          <w:sz w:val="28"/>
+          <w:szCs w:val="28"/>
+          <w:lang w:val="ru-RU"/>
+        </w:rPr>
+        <w:t xml:space="preserve">… </w:t>
+      </w:r>
+      <w:r>
+        <w:rPr>
+          <w:rFonts w:ascii="Times New Roman" w:hAnsi="Times New Roman" w:cs="Times New Roman"/>
+          <w:sz w:val="28"/>
+          <w:szCs w:val="28"/>
+          <w:lang w:val="ru-RU"/>
+        </w:rPr>
+        <w:t>11010110 01100101 00001011 00100111 00111000 11100100</w:t>
+      </w:r>
+    </w:p>
+    <w:p>
+      <w:pPr>
+        <w:rPr>
+          <w:rFonts w:ascii="Times New Roman" w:hAnsi="Times New Roman" w:cs="Times New Roman"/>
+          <w:sz w:val="28"/>
+          <w:szCs w:val="28"/>
+          <w:lang w:val="ru-RU"/>
+        </w:rPr>
+      </w:pPr>
+      <w:proofErr w:type="spellStart"/>
+      <w:r>
+        <w:rPr>
+          <w:rFonts w:ascii="Times New Roman" w:hAnsi="Times New Roman" w:cs="Times New Roman"/>
+          <w:sz w:val="28"/>
+          <w:szCs w:val="28"/>
+          <w:lang w:val="ru-RU"/>
+        </w:rPr>
+        <w:t>Шифротекст</w:t>
+      </w:r>
+      <w:proofErr w:type="spellEnd"/>
+      <w:r>
+        <w:rPr>
+          <w:rFonts w:ascii="Times New Roman" w:hAnsi="Times New Roman" w:cs="Times New Roman"/>
+          <w:sz w:val="28"/>
+          <w:szCs w:val="28"/>
+          <w:lang w:val="ru-RU"/>
+        </w:rPr>
+        <w:t xml:space="preserve"> (.</w:t>
+      </w:r>
+      <w:r>
+        <w:rPr>
+          <w:rFonts w:ascii="Times New Roman" w:hAnsi="Times New Roman" w:cs="Times New Roman"/>
+          <w:sz w:val="28"/>
+          <w:szCs w:val="28"/>
+          <w:lang w:val="en-US"/>
+        </w:rPr>
+        <w:t>txt</w:t>
+      </w:r>
+      <w:r>
+        <w:rPr>
+          <w:rFonts w:ascii="Times New Roman" w:hAnsi="Times New Roman" w:cs="Times New Roman"/>
+          <w:sz w:val="28"/>
+          <w:szCs w:val="28"/>
+          <w:lang w:val="ru-RU"/>
+        </w:rPr>
+        <w:t>)</w:t>
+      </w:r>
+      <w:r>
+        <w:rPr>
+          <w:rFonts w:ascii="Times New Roman" w:hAnsi="Times New Roman" w:cs="Times New Roman"/>
+          <w:sz w:val="28"/>
+          <w:szCs w:val="28"/>
+          <w:lang w:val="ru-RU"/>
+        </w:rPr>
+        <w:t>:</w:t>
+      </w:r>
+      <w:r>
+        <w:rPr>
+          <w:rFonts w:ascii="Times New Roman" w:hAnsi="Times New Roman" w:cs="Times New Roman"/>
+          <w:sz w:val="28"/>
+          <w:szCs w:val="28"/>
+          <w:lang w:val="ru-RU"/>
+        </w:rPr>
+        <w:t xml:space="preserve"> </w:t>
+      </w:r>
+      <w:r>
+        <w:rPr>
+          <w:rFonts w:ascii="Times New Roman" w:hAnsi="Times New Roman" w:cs="Times New Roman"/>
+          <w:sz w:val="28"/>
+          <w:szCs w:val="28"/>
+          <w:lang w:val="ru-RU"/>
+        </w:rPr>
+        <w:t>яяяЯ</w:t>
+      </w:r>
+      <w:proofErr w:type="gramStart"/>
+      <w:r>
+        <w:rPr>
+          <w:rFonts w:ascii="Times New Roman" w:hAnsi="Times New Roman" w:cs="Times New Roman"/>
+          <w:sz w:val="28"/>
+          <w:szCs w:val="28"/>
+          <w:lang w:val="ru-RU"/>
+        </w:rPr>
+        <w:t>3!,</w:t>
+      </w:r>
+      <w:proofErr w:type="gramEnd"/>
+      <w:r>
+        <w:rPr>
+          <w:rFonts w:ascii="Times New Roman" w:hAnsi="Times New Roman" w:cs="Times New Roman"/>
+          <w:sz w:val="28"/>
+          <w:szCs w:val="28"/>
+          <w:lang w:val="ru-RU"/>
+        </w:rPr>
+        <w:t>0ҐїЎ</w:t>
+      </w:r>
+    </w:p>
+    <w:p>
+      <w:pPr>
+        <w:rPr>
+          <w:rFonts w:ascii="Times New Roman" w:hAnsi="Times New Roman" w:cs="Times New Roman"/>
+          <w:sz w:val="28"/>
+          <w:szCs w:val="28"/>
+          <w:lang w:val="ru-RU"/>
+        </w:rPr>
+      </w:pPr>
+      <w:proofErr w:type="spellStart"/>
+      <w:r>
+        <w:rPr>
+          <w:rFonts w:ascii="Times New Roman" w:hAnsi="Times New Roman" w:cs="Times New Roman"/>
+          <w:sz w:val="28"/>
+          <w:szCs w:val="28"/>
+          <w:lang w:val="ru-RU"/>
+        </w:rPr>
+        <w:t>ооє</w:t>
+      </w:r>
+      <w:proofErr w:type="spellEnd"/>
+      <w:r>
+        <w:rPr>
+          <w:rFonts w:ascii="Times New Roman" w:hAnsi="Times New Roman" w:cs="Times New Roman"/>
+          <w:sz w:val="28"/>
+          <w:szCs w:val="28"/>
+          <w:lang w:val="ru-RU"/>
+        </w:rPr>
+        <w:t xml:space="preserve">™ </w:t>
+      </w:r>
+      <w:r>
+        <w:rPr>
+          <w:rFonts w:ascii="Times New Roman" w:hAnsi="Times New Roman" w:cs="Times New Roman"/>
+          <w:sz w:val="28"/>
+          <w:szCs w:val="28"/>
+          <w:lang w:val="ru-RU"/>
+        </w:rPr>
+        <w:t>¬®</w:t>
+      </w:r>
+    </w:p>
+    <w:p>
+      <w:pPr>
+        <w:rPr>
+          <w:rFonts w:ascii="Times New Roman" w:hAnsi="Times New Roman" w:cs="Times New Roman"/>
+          <w:sz w:val="28"/>
+          <w:szCs w:val="28"/>
+          <w:lang w:val="ru-RU"/>
+        </w:rPr>
+      </w:pPr>
+      <w:proofErr w:type="spellStart"/>
+      <w:r>
+        <w:rPr>
+          <w:rFonts w:ascii="Times New Roman" w:hAnsi="Times New Roman" w:cs="Times New Roman"/>
+          <w:sz w:val="28"/>
+          <w:szCs w:val="28"/>
+          <w:lang w:val="ru-RU"/>
+        </w:rPr>
+        <w:t>I•Ьeъmє</w:t>
+      </w:r>
+      <w:proofErr w:type="spellEnd"/>
+      <w:r>
+        <w:rPr>
+          <w:rFonts w:ascii="Times New Roman" w:hAnsi="Times New Roman" w:cs="Times New Roman"/>
+          <w:sz w:val="28"/>
+          <w:szCs w:val="28"/>
+          <w:lang w:val="ru-RU"/>
+        </w:rPr>
+        <w:continuationSeparator/>
+      </w:r>
+      <w:r>
+        <w:rPr>
+          <w:rFonts w:ascii="Times New Roman" w:hAnsi="Times New Roman" w:cs="Times New Roman"/>
+          <w:sz w:val="28"/>
+          <w:szCs w:val="28"/>
+          <w:lang w:val="ru-RU"/>
+        </w:rPr>
+        <w:t/>
+      </w:r>
+      <w:r>
+        <w:rPr>
+          <w:rFonts w:ascii="Times New Roman" w:hAnsi="Times New Roman" w:cs="Times New Roman"/>
+          <w:sz w:val="28"/>
+          <w:szCs w:val="28"/>
+          <w:lang w:val="ru-RU"/>
+        </w:rPr>
+        <w:t>®`џ}</w:t>
+      </w:r>
+      <w:proofErr w:type="gramStart"/>
+      <w:r>
+        <w:rPr>
+          <w:rFonts w:ascii="Times New Roman" w:hAnsi="Times New Roman" w:cs="Times New Roman"/>
+          <w:sz w:val="28"/>
+          <w:szCs w:val="28"/>
+          <w:lang w:val="ru-RU"/>
+        </w:rPr>
+        <w:t>!&gt;k</w:t>
+      </w:r>
+      <w:proofErr w:type="gramEnd"/>
+      <w:r>
+        <w:rPr>
+          <w:rFonts w:ascii="Times New Roman" w:hAnsi="Times New Roman" w:cs="Times New Roman"/>
+          <w:sz w:val="28"/>
+          <w:szCs w:val="28"/>
+          <w:lang w:val="ru-RU"/>
+        </w:rPr>
+        <w:t>–</w:t>
+      </w:r>
+      <w:proofErr w:type="spellStart"/>
+      <w:r>
+        <w:rPr>
+          <w:rFonts w:ascii="Times New Roman" w:hAnsi="Times New Roman" w:cs="Times New Roman"/>
+          <w:sz w:val="28"/>
+          <w:szCs w:val="28"/>
+          <w:lang w:val="ru-RU"/>
+        </w:rPr>
+        <w:t>Gэg€r</w:t>
+      </w:r>
+      <w:proofErr w:type="spellEnd"/>
+      <w:r>
+        <w:rPr>
+          <w:rFonts w:ascii="Times New Roman" w:hAnsi="Times New Roman" w:cs="Times New Roman"/>
+          <w:sz w:val="28"/>
+          <w:szCs w:val="28"/>
+          <w:lang w:val="ru-RU"/>
+        </w:rPr>
+        <w:t>—</w:t>
+      </w:r>
+      <w:proofErr w:type="spellStart"/>
+      <w:r>
+        <w:rPr>
+          <w:rFonts w:ascii="Times New Roman" w:hAnsi="Times New Roman" w:cs="Times New Roman"/>
+          <w:sz w:val="28"/>
+          <w:szCs w:val="28"/>
+          <w:lang w:val="ru-RU"/>
+        </w:rPr>
+        <w:t>ВdP</w:t>
+      </w:r>
+      <w:proofErr w:type="spellEnd"/>
+      <w:r>
+        <w:rPr>
+          <w:rFonts w:ascii="Times New Roman" w:hAnsi="Times New Roman" w:cs="Times New Roman"/>
+          <w:sz w:val="28"/>
+          <w:szCs w:val="28"/>
+          <w:lang w:val="ru-RU"/>
+        </w:rPr>
+        <w:t>¦</w:t>
+      </w:r>
+      <w:proofErr w:type="spellStart"/>
+      <w:r>
+        <w:rPr>
+          <w:rFonts w:ascii="Times New Roman" w:hAnsi="Times New Roman" w:cs="Times New Roman"/>
+          <w:sz w:val="28"/>
+          <w:szCs w:val="28"/>
+          <w:lang w:val="ru-RU"/>
+        </w:rPr>
+        <w:t>qXІ</w:t>
+      </w:r>
+      <w:proofErr w:type="spellEnd"/>
+    </w:p>
+    <w:p>
+      <w:pPr>
+        <w:rPr>
+          <w:rFonts w:ascii="Times New Roman" w:hAnsi="Times New Roman" w:cs="Times New Roman"/>
+          <w:sz w:val="28"/>
+          <w:szCs w:val="28"/>
+          <w:lang w:val="ru-RU"/>
+        </w:rPr>
+      </w:pPr>
+    </w:p>
+    <w:p>
+      <w:pPr>
+        <w:rPr>
+          <w:rFonts w:ascii="Times New Roman" w:hAnsi="Times New Roman" w:cs="Times New Roman"/>
+          <w:sz w:val="28"/>
+          <w:szCs w:val="28"/>
+          <w:lang w:val="ru-RU"/>
+        </w:rPr>
+      </w:pPr>
+      <w:r>
+        <w:rPr>
+          <w:rFonts w:ascii="Times New Roman" w:hAnsi="Times New Roman" w:cs="Times New Roman"/>
+          <w:sz w:val="28"/>
+          <w:szCs w:val="28"/>
+          <w:lang w:val="ru-RU"/>
+        </w:rPr>
+        <w:drawing>
+          <wp:inline distT="0" distB="0" distL="0" distR="0" wp14:anchorId="68FFB02D" wp14:editId="2449FDC7">
+            <wp:extent cx="5940425" cy="2924810"/>
+            <wp:effectExtent l="0" t="0" r="3175" b="8890"/>
+            <wp:docPr id="12" name="Рисунок 12"/>
+            <wp:cNvGraphicFramePr>
+              <a:graphicFrameLocks xmlns:a="http://schemas.openxmlformats.org/drawingml/2006/main" noChangeAspect="1"/>
+            </wp:cNvGraphicFramePr>
+            <a:graphic xmlns:a="http://schemas.openxmlformats.org/drawingml/2006/main">
+              <a:graphicData uri="http://schemas.openxmlformats.org/drawingml/2006/picture">
+                <pic:pic xmlns:pic="http://schemas.openxmlformats.org/drawingml/2006/picture">
+                  <pic:nvPicPr>
+                    <pic:cNvPr id="1" name=""/>
+                    <pic:cNvPicPr/>
+                  </pic:nvPicPr>
+                  <pic:blipFill>
+                    <a:blip r:embed="rId50"/>
+                    <a:stretch>
+                      <a:fillRect/>
+                    </a:stretch>
+                  </pic:blipFill>
+                  <pic:spPr>
+                    <a:xfrm>
+                      <a:off x="0" y="0"/>
+                      <a:ext cx="5940425" cy="2924810"/>
+                    </a:xfrm>
+                    <a:prstGeom prst="rect">
+                      <a:avLst/>
+                    </a:prstGeom>
+                  </pic:spPr>
+                </pic:pic>
+              </a:graphicData>
+            </a:graphic>
+          </wp:inline>
+        </w:drawing>
+      </w:r>
+    </w:p>
+    <w:p>
+      <w:pPr>
+        <w:jc w:val="center"/>
+        <w:rPr>
+          <w:rFonts w:ascii="Times New Roman" w:hAnsi="Times New Roman" w:cs="Times New Roman"/>
+          <w:sz w:val="28"/>
+          <w:szCs w:val="28"/>
+          <w:lang w:val="en-US"/>
+        </w:rPr>
+      </w:pPr>
+      <w:r>
+        <w:rPr>
+          <w:rFonts w:ascii="Times New Roman" w:hAnsi="Times New Roman" w:cs="Times New Roman"/>
+          <w:sz w:val="28"/>
+          <w:szCs w:val="28"/>
+          <w:lang w:val="ru-RU"/>
+        </w:rPr>
+        <w:t>Рисунок</w:t>
+      </w:r>
+      <w:r>
+        <w:rPr>
+          <w:rFonts w:ascii="Times New Roman" w:hAnsi="Times New Roman" w:cs="Times New Roman"/>
+          <w:sz w:val="28"/>
+          <w:szCs w:val="28"/>
+          <w:lang w:val="en-US"/>
+        </w:rPr>
+        <w:t xml:space="preserve"> </w:t>
+      </w:r>
+      <w:r>
+        <w:rPr>
+          <w:rFonts w:ascii="Times New Roman" w:hAnsi="Times New Roman" w:cs="Times New Roman"/>
+          <w:sz w:val="28"/>
+          <w:szCs w:val="28"/>
+          <w:lang w:val="ru-RU"/>
+        </w:rPr>
+        <w:t>6</w:t>
+      </w:r>
+      <w:r>
+        <w:rPr>
+          <w:rFonts w:ascii="Times New Roman" w:hAnsi="Times New Roman" w:cs="Times New Roman"/>
+          <w:sz w:val="28"/>
+          <w:szCs w:val="28"/>
+          <w:lang w:val="en-US"/>
+        </w:rPr>
+        <w:t xml:space="preserve">.1 – </w:t>
+      </w:r>
+      <w:r>
+        <w:rPr>
+          <w:rFonts w:ascii="Times New Roman" w:hAnsi="Times New Roman" w:cs="Times New Roman"/>
+          <w:sz w:val="28"/>
+          <w:szCs w:val="28"/>
+          <w:lang w:val="ru-RU"/>
+        </w:rPr>
+        <w:t>Файл</w:t>
+      </w:r>
+      <w:r>
+        <w:rPr>
+          <w:rFonts w:ascii="Times New Roman" w:hAnsi="Times New Roman" w:cs="Times New Roman"/>
+          <w:sz w:val="28"/>
+          <w:szCs w:val="28"/>
+          <w:lang w:val="en-US"/>
+        </w:rPr>
+        <w:t xml:space="preserve"> </w:t>
+      </w:r>
+      <w:r>
+        <w:rPr>
+          <w:rFonts w:ascii="Times New Roman" w:hAnsi="Times New Roman" w:cs="Times New Roman"/>
+          <w:sz w:val="28"/>
+          <w:szCs w:val="28"/>
+          <w:lang w:val="en-US"/>
+        </w:rPr>
+        <w:t>audio (</w:t>
+      </w:r>
+      <w:r>
+        <w:rPr>
+          <w:rFonts w:ascii="Times New Roman" w:hAnsi="Times New Roman" w:cs="Times New Roman"/>
+          <w:sz w:val="28"/>
+          <w:szCs w:val="28"/>
+          <w:lang w:val="en-US"/>
+        </w:rPr>
+        <w:t>.</w:t>
+      </w:r>
+      <w:proofErr w:type="spellStart"/>
+      <w:r>
+        <w:rPr>
+          <w:rFonts w:ascii="Times New Roman" w:hAnsi="Times New Roman" w:cs="Times New Roman"/>
+          <w:sz w:val="28"/>
+          <w:szCs w:val="28"/>
+          <w:lang w:val="en-US"/>
+        </w:rPr>
+        <w:t>ogg</w:t>
+      </w:r>
+      <w:proofErr w:type="spellEnd"/>
+      <w:r>
+        <w:rPr>
+          <w:rFonts w:ascii="Times New Roman" w:hAnsi="Times New Roman" w:cs="Times New Roman"/>
+          <w:sz w:val="28"/>
+          <w:szCs w:val="28"/>
+          <w:lang w:val="en-US"/>
+        </w:rPr>
+        <w:t>)</w:t>
+      </w:r>
+    </w:p>
+    <w:p>
+      <w:pPr>
+        <w:jc w:val="center"/>
+        <w:rPr>
+          <w:rFonts w:ascii="Times New Roman" w:hAnsi="Times New Roman" w:cs="Times New Roman"/>
+          <w:sz w:val="28"/>
+          <w:szCs w:val="28"/>
+          <w:lang w:val="en-US"/>
+        </w:rPr>
+      </w:pPr>
+    </w:p>
+    <w:p>
+      <w:pPr>
+        <w:rPr>
+          <w:rFonts w:ascii="Times New Roman" w:hAnsi="Times New Roman" w:cs="Times New Roman"/>
+          <w:sz w:val="28"/>
+          <w:szCs w:val="28"/>
+          <w:lang w:val="ru-RU"/>
+        </w:rPr>
+      </w:pPr>
+      <w:r>
+        <w:rPr>
+          <w:rFonts w:ascii="Times New Roman" w:hAnsi="Times New Roman" w:cs="Times New Roman"/>
+          <w:noProof/>
+          <w:sz w:val="28"/>
+          <w:szCs w:val="28"/>
+          <w:lang w:val="ru-RU"/>
+        </w:rPr>
+        <w:lastRenderedPageBreak/>
+        <w:drawing>
+          <wp:inline distT="0" distB="0" distL="0" distR="0" wp14:anchorId="1C34DF25" wp14:editId="336162A0">
+            <wp:extent cx="5940425" cy="3331210"/>
+            <wp:effectExtent l="0" t="0" r="3175" b="2540"/>
+            <wp:docPr id="3" name="Рисунок 3"/>
+            <wp:cNvGraphicFramePr>
+              <a:graphicFrameLocks xmlns:a="http://schemas.openxmlformats.org/drawingml/2006/main" noChangeAspect="1"/>
+            </wp:cNvGraphicFramePr>
+            <a:graphic xmlns:a="http://schemas.openxmlformats.org/drawingml/2006/main">
+              <a:graphicData uri="http://schemas.openxmlformats.org/drawingml/2006/picture">
+                <pic:pic xmlns:pic="http://schemas.openxmlformats.org/drawingml/2006/picture">
+                  <pic:nvPicPr>
+                    <pic:cNvPr id="1" name=""/>
+                    <pic:cNvPicPr/>
+                  </pic:nvPicPr>
+                  <pic:blipFill>
+                    <a:blip r:embed="rId38"/>
+                    <a:stretch>
+                      <a:fillRect/>
+                    </a:stretch>
+                  </pic:blipFill>
+                  <pic:spPr>
+                    <a:xfrm>
+                      <a:off x="0" y="0"/>
+                      <a:ext cx="5940425" cy="3331210"/>
+                    </a:xfrm>
+                    <a:prstGeom prst="rect">
+                      <a:avLst/>
+                    </a:prstGeom>
+                  </pic:spPr>
+                </pic:pic>
+              </a:graphicData>
+            </a:graphic>
+          </wp:inline>
+        </w:drawing>
+      </w:r>
+    </w:p>
+    <w:p>
+      <w:pPr>
+        <w:jc w:val="center"/>
+        <w:rPr>
+          <w:rFonts w:ascii="Times New Roman" w:hAnsi="Times New Roman" w:cs="Times New Roman"/>
+          <w:sz w:val="28"/>
+          <w:szCs w:val="28"/>
+          <w:lang w:val="ru-RU"/>
+        </w:rPr>
+      </w:pPr>
+      <w:r>
+        <w:rPr>
+          <w:rFonts w:ascii="Times New Roman" w:hAnsi="Times New Roman" w:cs="Times New Roman"/>
+          <w:sz w:val="28"/>
+          <w:szCs w:val="28"/>
+          <w:lang w:val="ru-RU"/>
+        </w:rPr>
+        <w:t xml:space="preserve">Рисунок </w:t>
+      </w:r>
+      <w:r>
+        <w:rPr>
+          <w:rFonts w:ascii="Times New Roman" w:hAnsi="Times New Roman" w:cs="Times New Roman"/>
+          <w:sz w:val="28"/>
+          <w:szCs w:val="28"/>
+          <w:lang w:val="ru-RU"/>
+        </w:rPr>
+        <w:t>6</w:t>
+      </w:r>
+      <w:r>
+        <w:rPr>
+          <w:rFonts w:ascii="Times New Roman" w:hAnsi="Times New Roman" w:cs="Times New Roman"/>
+          <w:sz w:val="28"/>
+          <w:szCs w:val="28"/>
+          <w:lang w:val="ru-RU"/>
+        </w:rPr>
+        <w:t xml:space="preserve">.2 – Проверка в </w:t>
+      </w:r>
+      <w:r>
+        <w:rPr>
+          <w:rFonts w:ascii="Times New Roman" w:hAnsi="Times New Roman" w:cs="Times New Roman"/>
+          <w:sz w:val="28"/>
+          <w:szCs w:val="28"/>
+          <w:lang w:val="en-US"/>
+        </w:rPr>
+        <w:t>Excel</w:t>
+      </w:r>
+      <w:r>
+        <w:rPr>
+          <w:rFonts w:ascii="Times New Roman" w:hAnsi="Times New Roman" w:cs="Times New Roman"/>
+          <w:sz w:val="28"/>
+          <w:szCs w:val="28"/>
+          <w:lang w:val="ru-RU"/>
+        </w:rPr>
+        <w:t xml:space="preserve"> (</w:t>
+      </w:r>
+      <w:r>
+        <w:rPr>
+          <w:rFonts w:ascii="Times New Roman" w:hAnsi="Times New Roman" w:cs="Times New Roman"/>
+          <w:sz w:val="28"/>
+          <w:szCs w:val="28"/>
+          <w:lang w:val="ru-RU"/>
+        </w:rPr>
+        <w:t>1-24</w:t>
+      </w:r>
+      <w:r>
+        <w:rPr>
+          <w:rFonts w:ascii="Times New Roman" w:hAnsi="Times New Roman" w:cs="Times New Roman"/>
+          <w:sz w:val="28"/>
+          <w:szCs w:val="28"/>
+          <w:lang w:val="ru-RU"/>
+        </w:rPr>
+        <w:t>)</w:t>
+      </w:r>
+    </w:p>
+    <w:p>
+      <w:pPr>
+        <w:jc w:val="center"/>
+        <w:rPr>
+          <w:rFonts w:ascii="Times New Roman" w:hAnsi="Times New Roman" w:cs="Times New Roman"/>
+          <w:sz w:val="28"/>
+          <w:szCs w:val="28"/>
+          <w:lang w:val="ru-RU"/>
+        </w:rPr>
+      </w:pPr>
+    </w:p>
+    <w:p>
+      <w:pPr>
+        <w:jc w:val="center"/>
+        <w:rPr>
+          <w:rFonts w:ascii="Times New Roman" w:hAnsi="Times New Roman" w:cs="Times New Roman"/>
+          <w:sz w:val="28"/>
+          <w:szCs w:val="28"/>
+          <w:lang w:val="ru-RU"/>
+        </w:rPr>
+      </w:pPr>
+      <w:r>
+        <w:rPr>
+          <w:rFonts w:ascii="Times New Roman" w:hAnsi="Times New Roman" w:cs="Times New Roman"/>
+          <w:noProof/>
+          <w:sz w:val="28"/>
+          <w:szCs w:val="28"/>
+          <w:lang w:val="ru-RU"/>
+        </w:rPr>
+        <w:drawing>
+          <wp:inline distT="0" distB="0" distL="0" distR="0" wp14:anchorId="3A115D98" wp14:editId="47405AA9">
+            <wp:extent cx="5940425" cy="3328035"/>
+            <wp:effectExtent l="0" t="0" r="3175" b="5715"/>
+            <wp:docPr id="4" name="Рисунок 4"/>
+            <wp:cNvGraphicFramePr>
+              <a:graphicFrameLocks xmlns:a="http://schemas.openxmlformats.org/drawingml/2006/main" noChangeAspect="1"/>
+            </wp:cNvGraphicFramePr>
+            <a:graphic xmlns:a="http://schemas.openxmlformats.org/drawingml/2006/main">
+              <a:graphicData uri="http://schemas.openxmlformats.org/drawingml/2006/picture">
+                <pic:pic xmlns:pic="http://schemas.openxmlformats.org/drawingml/2006/picture">
+                  <pic:nvPicPr>
+                    <pic:cNvPr id="1" name=""/>
+                    <pic:cNvPicPr/>
+                  </pic:nvPicPr>
+                  <pic:blipFill>
+                    <a:blip r:embed="rId39"/>
+                    <a:stretch>
+                      <a:fillRect/>
+                    </a:stretch>
+                  </pic:blipFill>
+                  <pic:spPr>
+                    <a:xfrm>
+                      <a:off x="0" y="0"/>
+                      <a:ext cx="5940425" cy="3328035"/>
+                    </a:xfrm>
+                    <a:prstGeom prst="rect">
+                      <a:avLst/>
+                    </a:prstGeom>
+                  </pic:spPr>
+                </pic:pic>
+              </a:graphicData>
+            </a:graphic>
+          </wp:inline>
+        </w:drawing>
+      </w:r>
+    </w:p>
+    <w:p>
+      <w:pPr>
+        <w:jc w:val="center"/>
+        <w:rPr>
+          <w:rFonts w:ascii="Times New Roman" w:hAnsi="Times New Roman" w:cs="Times New Roman"/>
+          <w:sz w:val="28"/>
+          <w:szCs w:val="28"/>
+          <w:lang w:val="ru-RU"/>
+        </w:rPr>
+      </w:pPr>
+      <w:r>
+        <w:rPr>
+          <w:rFonts w:ascii="Times New Roman" w:hAnsi="Times New Roman" w:cs="Times New Roman"/>
+          <w:sz w:val="28"/>
+          <w:szCs w:val="28"/>
+          <w:lang w:val="ru-RU"/>
+        </w:rPr>
+        <w:t xml:space="preserve">Рисунок </w:t>
+      </w:r>
+      <w:r>
+        <w:rPr>
+          <w:rFonts w:ascii="Times New Roman" w:hAnsi="Times New Roman" w:cs="Times New Roman"/>
+          <w:sz w:val="28"/>
+          <w:szCs w:val="28"/>
+          <w:lang w:val="ru-RU"/>
+        </w:rPr>
+        <w:t>6</w:t>
+      </w:r>
+      <w:r>
+        <w:rPr>
+          <w:rFonts w:ascii="Times New Roman" w:hAnsi="Times New Roman" w:cs="Times New Roman"/>
+          <w:sz w:val="28"/>
+          <w:szCs w:val="28"/>
+          <w:lang w:val="ru-RU"/>
+        </w:rPr>
+        <w:t xml:space="preserve">.3 – Проверка в </w:t>
+      </w:r>
+      <w:r>
+        <w:rPr>
+          <w:rFonts w:ascii="Times New Roman" w:hAnsi="Times New Roman" w:cs="Times New Roman"/>
+          <w:sz w:val="28"/>
+          <w:szCs w:val="28"/>
+          <w:lang w:val="en-US"/>
+        </w:rPr>
+        <w:t>Excel</w:t>
+      </w:r>
+      <w:r>
+        <w:rPr>
+          <w:rFonts w:ascii="Times New Roman" w:hAnsi="Times New Roman" w:cs="Times New Roman"/>
+          <w:sz w:val="28"/>
+          <w:szCs w:val="28"/>
+          <w:lang w:val="ru-RU"/>
+        </w:rPr>
+        <w:t xml:space="preserve"> (</w:t>
+      </w:r>
+      <w:r>
+        <w:rPr>
+          <w:rFonts w:ascii="Times New Roman" w:hAnsi="Times New Roman" w:cs="Times New Roman"/>
+          <w:sz w:val="28"/>
+          <w:szCs w:val="28"/>
+          <w:lang w:val="ru-RU"/>
+        </w:rPr>
+        <w:t>25-49</w:t>
+      </w:r>
+      <w:r>
+        <w:rPr>
+          <w:rFonts w:ascii="Times New Roman" w:hAnsi="Times New Roman" w:cs="Times New Roman"/>
+          <w:sz w:val="28"/>
+          <w:szCs w:val="28"/>
+          <w:lang w:val="ru-RU"/>
+        </w:rPr>
+        <w:t>)</w:t>
+      </w:r>
+    </w:p>
+    <w:p>
+      <w:pPr>
+        <w:jc w:val="center"/>
+        <w:rPr>
+          <w:rFonts w:ascii="Times New Roman" w:hAnsi="Times New Roman" w:cs="Times New Roman"/>
+          <w:sz w:val="28"/>
+          <w:szCs w:val="28"/>
+          <w:lang w:val="ru-RU"/>
+        </w:rPr>
+      </w:pPr>
+      <w:r>
+        <w:rPr>
+          <w:rFonts w:ascii="Times New Roman" w:hAnsi="Times New Roman" w:cs="Times New Roman"/>
+          <w:noProof/>
+          <w:sz w:val="28"/>
+          <w:szCs w:val="28"/>
+          <w:lang w:val="ru-RU"/>
+        </w:rPr>
+        <w:lastRenderedPageBreak/>
+        <w:drawing>
+          <wp:inline distT="0" distB="0" distL="0" distR="0" wp14:anchorId="0AE2DDAA" wp14:editId="3C5E752F">
+            <wp:extent cx="5940425" cy="3335655"/>
+            <wp:effectExtent l="0" t="0" r="3175" b="0"/>
+            <wp:docPr id="7" name="Рисунок 7"/>
+            <wp:cNvGraphicFramePr>
+              <a:graphicFrameLocks xmlns:a="http://schemas.openxmlformats.org/drawingml/2006/main" noChangeAspect="1"/>
+            </wp:cNvGraphicFramePr>
+            <a:graphic xmlns:a="http://schemas.openxmlformats.org/drawingml/2006/main">
+              <a:graphicData uri="http://schemas.openxmlformats.org/drawingml/2006/picture">
+                <pic:pic xmlns:pic="http://schemas.openxmlformats.org/drawingml/2006/picture">
+                  <pic:nvPicPr>
+                    <pic:cNvPr id="1" name=""/>
+                    <pic:cNvPicPr/>
+                  </pic:nvPicPr>
+                  <pic:blipFill>
+                    <a:blip r:embed="rId40"/>
+                    <a:stretch>
+                      <a:fillRect/>
+                    </a:stretch>
+                  </pic:blipFill>
+                  <pic:spPr>
+                    <a:xfrm>
+                      <a:off x="0" y="0"/>
+                      <a:ext cx="5940425" cy="3335655"/>
+                    </a:xfrm>
+                    <a:prstGeom prst="rect">
+                      <a:avLst/>
+                    </a:prstGeom>
+                  </pic:spPr>
+                </pic:pic>
+              </a:graphicData>
+            </a:graphic>
+          </wp:inline>
+        </w:drawing>
+      </w:r>
+    </w:p>
+    <w:p>
+      <w:pPr>
+        <w:jc w:val="center"/>
+        <w:rPr>
+          <w:rFonts w:ascii="Times New Roman" w:hAnsi="Times New Roman" w:cs="Times New Roman"/>
+          <w:sz w:val="28"/>
+          <w:szCs w:val="28"/>
+          <w:lang w:val="ru-RU"/>
+        </w:rPr>
+      </w:pPr>
+      <w:r>
+        <w:rPr>
+          <w:rFonts w:ascii="Times New Roman" w:hAnsi="Times New Roman" w:cs="Times New Roman"/>
+          <w:sz w:val="28"/>
+          <w:szCs w:val="28"/>
+          <w:lang w:val="ru-RU"/>
+        </w:rPr>
+        <w:t xml:space="preserve">Рисунок </w:t>
+      </w:r>
+      <w:r>
+        <w:rPr>
+          <w:rFonts w:ascii="Times New Roman" w:hAnsi="Times New Roman" w:cs="Times New Roman"/>
+          <w:sz w:val="28"/>
+          <w:szCs w:val="28"/>
+          <w:lang w:val="ru-RU"/>
+        </w:rPr>
+        <w:t>6</w:t>
+      </w:r>
+      <w:r>
+        <w:rPr>
+          <w:rFonts w:ascii="Times New Roman" w:hAnsi="Times New Roman" w:cs="Times New Roman"/>
+          <w:sz w:val="28"/>
+          <w:szCs w:val="28"/>
+          <w:lang w:val="ru-RU"/>
+        </w:rPr>
+        <w:t xml:space="preserve">.4 – Проверка в </w:t>
+      </w:r>
+      <w:r>
+        <w:rPr>
+          <w:rFonts w:ascii="Times New Roman" w:hAnsi="Times New Roman" w:cs="Times New Roman"/>
+          <w:sz w:val="28"/>
+          <w:szCs w:val="28"/>
+          <w:lang w:val="en-US"/>
+        </w:rPr>
+        <w:t>Excel</w:t>
+      </w:r>
+      <w:r>
+        <w:rPr>
+          <w:rFonts w:ascii="Times New Roman" w:hAnsi="Times New Roman" w:cs="Times New Roman"/>
+          <w:sz w:val="28"/>
+          <w:szCs w:val="28"/>
+          <w:lang w:val="ru-RU"/>
+        </w:rPr>
+        <w:t xml:space="preserve"> (</w:t>
+      </w:r>
+      <w:r>
+        <w:rPr>
+          <w:rFonts w:ascii="Times New Roman" w:hAnsi="Times New Roman" w:cs="Times New Roman"/>
+          <w:sz w:val="28"/>
+          <w:szCs w:val="28"/>
+          <w:lang w:val="ru-RU"/>
+        </w:rPr>
+        <w:t>50-74</w:t>
+      </w:r>
+      <w:r>
+        <w:rPr>
+          <w:rFonts w:ascii="Times New Roman" w:hAnsi="Times New Roman" w:cs="Times New Roman"/>
+          <w:sz w:val="28"/>
+          <w:szCs w:val="28"/>
+          <w:lang w:val="ru-RU"/>
+        </w:rPr>
+        <w:t>)</w:t>
+      </w:r>
+    </w:p>
+    <w:p>
+      <w:pPr>
+        <w:rPr>
+          <w:rFonts w:ascii="Times New Roman" w:hAnsi="Times New Roman" w:cs="Times New Roman"/>
+          <w:sz w:val="28"/>
+          <w:szCs w:val="28"/>
+          <w:lang w:val="ru-RU"/>
+        </w:rPr>
+      </w:pPr>
+    </w:p>
+    <w:p>
+      <w:pPr>
+        <w:rPr>
+          <w:rFonts w:ascii="Times New Roman" w:hAnsi="Times New Roman" w:cs="Times New Roman"/>
+          <w:sz w:val="28"/>
+          <w:szCs w:val="28"/>
+          <w:lang w:val="ru-RU"/>
+        </w:rPr>
+      </w:pPr>
+      <w:r>
+        <w:rPr>
+          <w:rFonts w:ascii="Times New Roman" w:hAnsi="Times New Roman" w:cs="Times New Roman"/>
+          <w:sz w:val="28"/>
+          <w:szCs w:val="28"/>
+          <w:lang w:val="ru-RU"/>
+        </w:rPr>
+        <w:t xml:space="preserve">Представлять полностью в </w:t>
+      </w:r>
+      <w:r>
+        <w:rPr>
+          <w:rFonts w:ascii="Times New Roman" w:hAnsi="Times New Roman" w:cs="Times New Roman"/>
+          <w:sz w:val="28"/>
+          <w:szCs w:val="28"/>
+          <w:lang w:val="en-US"/>
+        </w:rPr>
+        <w:t>Excel</w:t>
+      </w:r>
+      <w:r>
+        <w:rPr>
+          <w:rFonts w:ascii="Times New Roman" w:hAnsi="Times New Roman" w:cs="Times New Roman"/>
+          <w:sz w:val="28"/>
+          <w:szCs w:val="28"/>
+          <w:lang w:val="ru-RU"/>
+        </w:rPr>
+        <w:t xml:space="preserve"> </w:t>
+      </w:r>
+      <w:r>
+        <w:rPr>
+          <w:rFonts w:ascii="Times New Roman" w:hAnsi="Times New Roman" w:cs="Times New Roman"/>
+          <w:sz w:val="28"/>
+          <w:szCs w:val="28"/>
+          <w:lang w:val="ru-RU"/>
+        </w:rPr>
+        <w:t>весь алгоритм не является рациональным, поэтому были продемонстрированы первые 74 шага</w:t>
+      </w:r>
+    </w:p>
+    <w:p>
+      <w:pPr>
+        <w:pStyle w:val="a3"/>
+        <w:jc w:val="center"/>
+      </w:pPr>
+      <w:r>
+        <w:lastRenderedPageBreak/>
+        <w:drawing>
+          <wp:inline distT="0" distB="0" distL="0" distR="0" wp14:anchorId="0F68379A" wp14:editId="3F117853">
+            <wp:extent cx="5940425" cy="4625340"/>
+            <wp:effectExtent l="0" t="0" r="3175" b="3810"/>
+            <wp:docPr id="13" name="Рисунок 13"/>
+            <wp:cNvGraphicFramePr>
+              <a:graphicFrameLocks xmlns:a="http://schemas.openxmlformats.org/drawingml/2006/main" noChangeAspect="1"/>
+            </wp:cNvGraphicFramePr>
+            <a:graphic xmlns:a="http://schemas.openxmlformats.org/drawingml/2006/main">
+              <a:graphicData uri="http://schemas.openxmlformats.org/drawingml/2006/picture">
+                <pic:pic xmlns:pic="http://schemas.openxmlformats.org/drawingml/2006/picture">
+                  <pic:nvPicPr>
+                    <pic:cNvPr id="1" name=""/>
+                    <pic:cNvPicPr/>
+                  </pic:nvPicPr>
+                  <pic:blipFill>
+                    <a:blip r:embed="rId51"/>
+                    <a:stretch>
+                      <a:fillRect/>
+                    </a:stretch>
+                  </pic:blipFill>
+                  <pic:spPr>
+                    <a:xfrm>
+                      <a:off x="0" y="0"/>
+                      <a:ext cx="5940425" cy="4625340"/>
+                    </a:xfrm>
+                    <a:prstGeom prst="rect">
+                      <a:avLst/>
+                    </a:prstGeom>
+                  </pic:spPr>
+                </pic:pic>
+              </a:graphicData>
+            </a:graphic>
+          </wp:inline>
+        </w:drawing>
+      </w:r>
+    </w:p>
+    <w:p>
+      <w:pPr>
+        <w:pStyle w:val="a3"/>
+        <w:jc w:val="center"/>
+        <w:rPr>
+          <w:rFonts w:eastAsiaTheme="minorHAnsi"/>
+          <w:sz w:val="28"/>
+          <w:szCs w:val="28"/>
+          <w:lang w:val="ru-RU" w:eastAsia="en-US"/>
+        </w:rPr>
+      </w:pPr>
+      <w:r>
+        <w:rPr>
+          <w:rFonts w:eastAsiaTheme="minorHAnsi"/>
+          <w:sz w:val="28"/>
+          <w:szCs w:val="28"/>
+          <w:lang w:val="ru-RU" w:eastAsia="en-US"/>
+        </w:rPr>
+        <w:t xml:space="preserve">Рисунок </w:t>
+      </w:r>
+      <w:r>
+        <w:rPr>
+          <w:rFonts w:eastAsiaTheme="minorHAnsi"/>
+          <w:sz w:val="28"/>
+          <w:szCs w:val="28"/>
+          <w:lang w:val="ru-RU" w:eastAsia="en-US"/>
+        </w:rPr>
+        <w:t>6</w:t>
+      </w:r>
+      <w:r>
+        <w:rPr>
+          <w:rFonts w:eastAsiaTheme="minorHAnsi"/>
+          <w:sz w:val="28"/>
+          <w:szCs w:val="28"/>
+          <w:lang w:val="ru-RU" w:eastAsia="en-US"/>
+        </w:rPr>
+        <w:t>.5</w:t>
+      </w:r>
+      <w:r>
+        <w:rPr>
+          <w:rFonts w:eastAsiaTheme="minorHAnsi"/>
+          <w:sz w:val="28"/>
+          <w:szCs w:val="28"/>
+          <w:lang w:val="ru-RU" w:eastAsia="en-US"/>
+        </w:rPr>
+        <w:t xml:space="preserve"> – </w:t>
+      </w:r>
+      <w:r>
+        <w:rPr>
+          <w:rFonts w:eastAsiaTheme="minorHAnsi"/>
+          <w:sz w:val="28"/>
+          <w:szCs w:val="28"/>
+          <w:lang w:val="ru-RU" w:eastAsia="en-US"/>
+        </w:rPr>
+        <w:t>Результат шифрования (</w:t>
+      </w:r>
+      <w:proofErr w:type="spellStart"/>
+      <w:r>
+        <w:rPr>
+          <w:rFonts w:eastAsiaTheme="minorHAnsi"/>
+          <w:sz w:val="28"/>
+          <w:szCs w:val="28"/>
+          <w:lang w:val="ru-RU" w:eastAsia="en-US"/>
+        </w:rPr>
+        <w:t>побитово</w:t>
+      </w:r>
+      <w:proofErr w:type="spellEnd"/>
+      <w:r>
+        <w:rPr>
+          <w:rFonts w:eastAsiaTheme="minorHAnsi"/>
+          <w:sz w:val="28"/>
+          <w:szCs w:val="28"/>
+          <w:lang w:val="ru-RU" w:eastAsia="en-US"/>
+        </w:rPr>
+        <w:t>)</w:t>
+      </w:r>
+    </w:p>
+    <w:p>
+      <w:pPr>
+        <w:pStyle w:val="a3"/>
+        <w:jc w:val="center"/>
+        <w:rPr>
+          <w:lang w:val="ru-RU"/>
+        </w:rPr>
+      </w:pPr>
+    </w:p>
+    <w:p>
+      <w:pPr>
+        <w:pStyle w:val="a3"/>
+        <w:jc w:val="center"/>
+        <w:rPr>
+          <w:lang w:val="en-US"/>
+        </w:rPr>
+      </w:pPr>
+      <w:r>
+        <w:rPr>
+          <w:lang w:val="ru-RU"/>
+        </w:rPr>
+        <w:drawing>
+          <wp:inline distT="0" distB="0" distL="0" distR="0" wp14:anchorId="7689E9C6" wp14:editId="04E80EF3">
+            <wp:extent cx="5940425" cy="3209290"/>
+            <wp:effectExtent l="0" t="0" r="3175" b="0"/>
+            <wp:docPr id="14" name="Рисунок 14"/>
+            <wp:cNvGraphicFramePr>
+              <a:graphicFrameLocks xmlns:a="http://schemas.openxmlformats.org/drawingml/2006/main" noChangeAspect="1"/>
+            </wp:cNvGraphicFramePr>
+            <a:graphic xmlns:a="http://schemas.openxmlformats.org/drawingml/2006/main">
+              <a:graphicData uri="http://schemas.openxmlformats.org/drawingml/2006/picture">
+                <pic:pic xmlns:pic="http://schemas.openxmlformats.org/drawingml/2006/picture">
+                  <pic:nvPicPr>
+                    <pic:cNvPr id="1" name=""/>
+                    <pic:cNvPicPr/>
+                  </pic:nvPicPr>
+                  <pic:blipFill>
+                    <a:blip r:embed="rId52"/>
+                    <a:stretch>
+                      <a:fillRect/>
+                    </a:stretch>
+                  </pic:blipFill>
+                  <pic:spPr>
+                    <a:xfrm>
+                      <a:off x="0" y="0"/>
+                      <a:ext cx="5940425" cy="3209290"/>
+                    </a:xfrm>
+                    <a:prstGeom prst="rect">
+                      <a:avLst/>
+                    </a:prstGeom>
+                  </pic:spPr>
+                </pic:pic>
+              </a:graphicData>
+            </a:graphic>
+          </wp:inline>
+        </w:drawing>
+      </w:r>
+    </w:p>
+    <w:p>
+      <w:pPr>
+        <w:pStyle w:val="a3"/>
+        <w:jc w:val="center"/>
+        <w:rPr>
+          <w:rFonts w:eastAsiaTheme="minorHAnsi"/>
+          <w:sz w:val="28"/>
+          <w:szCs w:val="28"/>
+          <w:lang w:val="en-US" w:eastAsia="en-US"/>
+        </w:rPr>
+      </w:pPr>
+      <w:r>
+        <w:rPr>
+          <w:rFonts w:eastAsiaTheme="minorHAnsi"/>
+          <w:sz w:val="28"/>
+          <w:szCs w:val="28"/>
+          <w:lang w:val="ru-RU" w:eastAsia="en-US"/>
+        </w:rPr>
+        <w:t xml:space="preserve">Рисунок </w:t>
+      </w:r>
+      <w:r>
+        <w:rPr>
+          <w:rFonts w:eastAsiaTheme="minorHAnsi"/>
+          <w:sz w:val="28"/>
+          <w:szCs w:val="28"/>
+          <w:lang w:val="ru-RU" w:eastAsia="en-US"/>
+        </w:rPr>
+        <w:t>6</w:t>
+      </w:r>
+      <w:r>
+        <w:rPr>
+          <w:rFonts w:eastAsiaTheme="minorHAnsi"/>
+          <w:sz w:val="28"/>
+          <w:szCs w:val="28"/>
+          <w:lang w:val="ru-RU" w:eastAsia="en-US"/>
+        </w:rPr>
+        <w:t>.6</w:t>
+      </w:r>
+      <w:r>
+        <w:rPr>
+          <w:rFonts w:eastAsiaTheme="minorHAnsi"/>
+          <w:sz w:val="28"/>
+          <w:szCs w:val="28"/>
+          <w:lang w:val="ru-RU" w:eastAsia="en-US"/>
+        </w:rPr>
+        <w:t xml:space="preserve"> – </w:t>
+      </w:r>
+      <w:r>
+        <w:rPr>
+          <w:rFonts w:eastAsiaTheme="minorHAnsi"/>
+          <w:sz w:val="28"/>
+          <w:szCs w:val="28"/>
+          <w:lang w:val="ru-RU" w:eastAsia="en-US"/>
+        </w:rPr>
+        <w:t>Результат шифрования (.</w:t>
+      </w:r>
+      <w:r>
+        <w:rPr>
+          <w:rFonts w:eastAsiaTheme="minorHAnsi"/>
+          <w:sz w:val="28"/>
+          <w:szCs w:val="28"/>
+          <w:lang w:val="en-US" w:eastAsia="en-US"/>
+        </w:rPr>
+        <w:t>txt</w:t>
+      </w:r>
+      <w:r>
+        <w:rPr>
+          <w:rFonts w:eastAsiaTheme="minorHAnsi"/>
+          <w:sz w:val="28"/>
+          <w:szCs w:val="28"/>
+          <w:lang w:val="ru-RU" w:eastAsia="en-US"/>
+        </w:rPr>
+        <w:t>)</w:t>
+      </w:r>
+    </w:p>
+    <w:p>
+      <w:pPr>
+        <w:jc w:val="center"/>
+        <w:rPr>
+          <w:rFonts w:ascii="Times New Roman" w:hAnsi="Times New Roman" w:cs="Times New Roman"/>
+          <w:sz w:val="28"/>
+          <w:szCs w:val="28"/>
+          <w:lang w:val="ru-RU"/>
+        </w:rPr>
+      </w:pPr>
+      <w:r>
+        <w:rPr>
+          <w:rFonts w:ascii="Times New Roman" w:hAnsi="Times New Roman" w:cs="Times New Roman"/>
+          <w:sz w:val="28"/>
+          <w:szCs w:val="28"/>
+          <w:lang w:val="ru-RU"/>
+        </w:rPr>
+        <w:lastRenderedPageBreak/>
+        <w:drawing>
+          <wp:inline distT="0" distB="0" distL="0" distR="0" wp14:anchorId="1D507FF3" wp14:editId="640B74DD">
+            <wp:extent cx="5940425" cy="4650105"/>
+            <wp:effectExtent l="0" t="0" r="3175" b="0"/>
+            <wp:docPr id="16" name="Рисунок 16"/>
+            <wp:cNvGraphicFramePr>
+              <a:graphicFrameLocks xmlns:a="http://schemas.openxmlformats.org/drawingml/2006/main" noChangeAspect="1"/>
+            </wp:cNvGraphicFramePr>
+            <a:graphic xmlns:a="http://schemas.openxmlformats.org/drawingml/2006/main">
+              <a:graphicData uri="http://schemas.openxmlformats.org/drawingml/2006/picture">
+                <pic:pic xmlns:pic="http://schemas.openxmlformats.org/drawingml/2006/picture">
+                  <pic:nvPicPr>
+                    <pic:cNvPr id="1" name=""/>
+                    <pic:cNvPicPr/>
+                  </pic:nvPicPr>
+                  <pic:blipFill>
+                    <a:blip r:embed="rId53"/>
+                    <a:stretch>
+                      <a:fillRect/>
+                    </a:stretch>
+                  </pic:blipFill>
+                  <pic:spPr>
+                    <a:xfrm>
+                      <a:off x="0" y="0"/>
+                      <a:ext cx="5940425" cy="4650105"/>
+                    </a:xfrm>
+                    <a:prstGeom prst="rect">
+                      <a:avLst/>
+                    </a:prstGeom>
+                  </pic:spPr>
+                </pic:pic>
+              </a:graphicData>
+            </a:graphic>
+          </wp:inline>
+        </w:drawing>
+      </w:r>
+    </w:p>
+    <w:p>
+      <w:pPr>
+        <w:jc w:val="center"/>
+        <w:rPr>
+          <w:rFonts w:ascii="Times New Roman" w:hAnsi="Times New Roman" w:cs="Times New Roman"/>
+          <w:sz w:val="28"/>
+          <w:szCs w:val="28"/>
+          <w:lang w:val="ru-RU"/>
+        </w:rPr>
+      </w:pPr>
+      <w:r>
+        <w:rPr>
+          <w:rFonts w:ascii="Times New Roman" w:hAnsi="Times New Roman" w:cs="Times New Roman"/>
+          <w:sz w:val="28"/>
+          <w:szCs w:val="28"/>
+          <w:lang w:val="ru-RU"/>
+        </w:rPr>
+        <w:t xml:space="preserve">Рисунок </w:t>
+      </w:r>
+      <w:r>
+        <w:rPr>
+          <w:rFonts w:ascii="Times New Roman" w:hAnsi="Times New Roman" w:cs="Times New Roman"/>
+          <w:sz w:val="28"/>
+          <w:szCs w:val="28"/>
+          <w:lang w:val="ru-RU"/>
+        </w:rPr>
+        <w:t>6</w:t>
+      </w:r>
+      <w:r>
+        <w:rPr>
+          <w:rFonts w:ascii="Times New Roman" w:hAnsi="Times New Roman" w:cs="Times New Roman"/>
+          <w:sz w:val="28"/>
+          <w:szCs w:val="28"/>
+          <w:lang w:val="ru-RU"/>
+        </w:rPr>
+        <w:t>.</w:t>
+      </w:r>
+      <w:r>
+        <w:rPr>
+          <w:rFonts w:ascii="Times New Roman" w:hAnsi="Times New Roman" w:cs="Times New Roman"/>
+          <w:sz w:val="28"/>
+          <w:szCs w:val="28"/>
+          <w:lang w:val="ru-RU"/>
+        </w:rPr>
+        <w:t>7 – Результат дешифрования (</w:t>
+      </w:r>
+      <w:proofErr w:type="spellStart"/>
+      <w:r>
+        <w:rPr>
+          <w:rFonts w:ascii="Times New Roman" w:hAnsi="Times New Roman" w:cs="Times New Roman"/>
+          <w:sz w:val="28"/>
+          <w:szCs w:val="28"/>
+          <w:lang w:val="ru-RU"/>
+        </w:rPr>
+        <w:t>побитово</w:t>
+      </w:r>
+      <w:proofErr w:type="spellEnd"/>
+      <w:r>
+        <w:rPr>
+          <w:rFonts w:ascii="Times New Roman" w:hAnsi="Times New Roman" w:cs="Times New Roman"/>
+          <w:sz w:val="28"/>
+          <w:szCs w:val="28"/>
+          <w:lang w:val="ru-RU"/>
+        </w:rPr>
+        <w:t>)</w:t>
+      </w:r>
+    </w:p>
+    <w:p>
+      <w:pPr>
+        <w:jc w:val="center"/>
+        <w:rPr>
+          <w:rFonts w:ascii="Times New Roman" w:hAnsi="Times New Roman" w:cs="Times New Roman"/>
+          <w:sz w:val="28"/>
+          <w:szCs w:val="28"/>
+          <w:lang w:val="ru-RU"/>
+        </w:rPr>
+      </w:pPr>
+    </w:p>
+    <w:p>
+      <w:pPr>
+        <w:jc w:val="center"/>
+        <w:rPr>
+          <w:rFonts w:ascii="Times New Roman" w:hAnsi="Times New Roman" w:cs="Times New Roman"/>
+          <w:sz w:val="28"/>
+          <w:szCs w:val="28"/>
+          <w:lang w:val="ru-RU"/>
+        </w:rPr>
+      </w:pPr>
+      <w:r>
+        <w:rPr>
+          <w:rFonts w:ascii="Times New Roman" w:hAnsi="Times New Roman" w:cs="Times New Roman"/>
+          <w:sz w:val="28"/>
+          <w:szCs w:val="28"/>
+          <w:lang w:val="ru-RU"/>
+        </w:rPr>
+        <w:drawing>
+          <wp:inline distT="0" distB="0" distL="0" distR="0" wp14:anchorId="53FCCDE8" wp14:editId="24754C89">
+            <wp:extent cx="5940425" cy="2840990"/>
+            <wp:effectExtent l="0" t="0" r="3175" b="0"/>
+            <wp:docPr id="29" name="Рисунок 29"/>
+            <wp:cNvGraphicFramePr>
+              <a:graphicFrameLocks xmlns:a="http://schemas.openxmlformats.org/drawingml/2006/main" noChangeAspect="1"/>
+            </wp:cNvGraphicFramePr>
+            <a:graphic xmlns:a="http://schemas.openxmlformats.org/drawingml/2006/main">
+              <a:graphicData uri="http://schemas.openxmlformats.org/drawingml/2006/picture">
+                <pic:pic xmlns:pic="http://schemas.openxmlformats.org/drawingml/2006/picture">
+                  <pic:nvPicPr>
+                    <pic:cNvPr id="1" name=""/>
+                    <pic:cNvPicPr/>
+                  </pic:nvPicPr>
+                  <pic:blipFill>
+                    <a:blip r:embed="rId54"/>
+                    <a:stretch>
+                      <a:fillRect/>
+                    </a:stretch>
+                  </pic:blipFill>
+                  <pic:spPr>
+                    <a:xfrm>
+                      <a:off x="0" y="0"/>
+                      <a:ext cx="5940425" cy="2840990"/>
+                    </a:xfrm>
+                    <a:prstGeom prst="rect">
+                      <a:avLst/>
+                    </a:prstGeom>
+                  </pic:spPr>
+                </pic:pic>
+              </a:graphicData>
+            </a:graphic>
+          </wp:inline>
+        </w:drawing>
+      </w:r>
+    </w:p>
+    <w:p>
+      <w:pPr>
+        <w:jc w:val="center"/>
+        <w:rPr>
+          <w:rFonts w:ascii="Times New Roman" w:hAnsi="Times New Roman" w:cs="Times New Roman"/>
+          <w:sz w:val="28"/>
+          <w:szCs w:val="28"/>
+          <w:lang w:val="ru-RU"/>
+        </w:rPr>
+      </w:pPr>
+      <w:r>
+        <w:rPr>
+          <w:rFonts w:ascii="Times New Roman" w:hAnsi="Times New Roman" w:cs="Times New Roman"/>
+          <w:sz w:val="28"/>
+          <w:szCs w:val="28"/>
+          <w:lang w:val="ru-RU"/>
+        </w:rPr>
+        <w:t xml:space="preserve">Рисунок </w:t>
+      </w:r>
+      <w:r>
+        <w:rPr>
+          <w:rFonts w:ascii="Times New Roman" w:hAnsi="Times New Roman" w:cs="Times New Roman"/>
+          <w:sz w:val="28"/>
+          <w:szCs w:val="28"/>
+          <w:lang w:val="ru-RU"/>
+        </w:rPr>
+        <w:t>6</w:t>
+      </w:r>
+      <w:r>
+        <w:rPr>
+          <w:rFonts w:ascii="Times New Roman" w:hAnsi="Times New Roman" w:cs="Times New Roman"/>
+          <w:sz w:val="28"/>
+          <w:szCs w:val="28"/>
+          <w:lang w:val="ru-RU"/>
+        </w:rPr>
+        <w:t>.</w:t>
+      </w:r>
+      <w:r>
+        <w:rPr>
+          <w:rFonts w:ascii="Times New Roman" w:hAnsi="Times New Roman" w:cs="Times New Roman"/>
+          <w:sz w:val="28"/>
+          <w:szCs w:val="28"/>
+          <w:lang w:val="ru-RU"/>
+        </w:rPr>
+        <w:t>8 – Результат дешифрования (</w:t>
+      </w:r>
+      <w:r>
+        <w:rPr>
+          <w:rFonts w:ascii="Times New Roman" w:hAnsi="Times New Roman" w:cs="Times New Roman"/>
+          <w:sz w:val="28"/>
+          <w:szCs w:val="28"/>
+          <w:lang w:val="ru-RU"/>
+        </w:rPr>
+        <w:t>.</w:t>
+      </w:r>
+      <w:proofErr w:type="spellStart"/>
+      <w:r>
+        <w:rPr>
+          <w:rFonts w:ascii="Times New Roman" w:hAnsi="Times New Roman" w:cs="Times New Roman"/>
+          <w:sz w:val="28"/>
+          <w:szCs w:val="28"/>
+          <w:lang w:val="en-US"/>
+        </w:rPr>
+        <w:t>mp</w:t>
+      </w:r>
+      <w:proofErr w:type="spellEnd"/>
+      <w:r>
+        <w:rPr>
+          <w:rFonts w:ascii="Times New Roman" w:hAnsi="Times New Roman" w:cs="Times New Roman"/>
+          <w:sz w:val="28"/>
+          <w:szCs w:val="28"/>
+          <w:lang w:val="ru-RU"/>
+        </w:rPr>
+        <w:t>4</w:t>
+      </w:r>
+      <w:r>
+        <w:rPr>
+          <w:rFonts w:ascii="Times New Roman" w:hAnsi="Times New Roman" w:cs="Times New Roman"/>
+          <w:sz w:val="28"/>
+          <w:szCs w:val="28"/>
+          <w:lang w:val="ru-RU"/>
+        </w:rPr>
+        <w:t>)</w:t>
+      </w:r>
+      <w:r>
+        <w:rPr>
+          <w:rFonts w:ascii="Times New Roman" w:hAnsi="Times New Roman" w:cs="Times New Roman"/>
+          <w:sz w:val="28"/>
+          <w:szCs w:val="28"/>
+          <w:lang w:val="ru-RU"/>
+        </w:rPr>
+        <w:t xml:space="preserve">. </w:t>
+      </w:r>
+      <w:r>
+        <w:rPr>
+          <w:rFonts w:ascii="Times New Roman" w:hAnsi="Times New Roman" w:cs="Times New Roman"/>
+          <w:sz w:val="28"/>
+          <w:szCs w:val="28"/>
+          <w:lang w:val="ru-RU"/>
+        </w:rPr>
+        <w:t xml:space="preserve">Запись идентична </w:t>
+      </w:r>
+      <w:r>
+        <w:rPr>
+          <w:rFonts w:ascii="Times New Roman" w:hAnsi="Times New Roman" w:cs="Times New Roman"/>
+          <w:sz w:val="28"/>
+          <w:szCs w:val="28"/>
+          <w:lang w:val="en-US"/>
+        </w:rPr>
+        <w:t>video</w:t>
+      </w:r>
+    </w:p>
+    <w:p>
+      <w:pPr>
+        <w:jc w:val="center"/>
+        <w:rPr>
+          <w:rFonts w:ascii="Times New Roman" w:hAnsi="Times New Roman" w:cs="Times New Roman"/>
+          <w:sz w:val="28"/>
+          <w:szCs w:val="28"/>
+          <w:lang w:val="ru-RU"/>
+        </w:rPr>
+      </w:pPr>
     </w:p>
     <w:sectPr>
       <w:pgSz w:w="11906" w:h="16838"/>

</xml_diff>